<commit_message>
Updated the file as per the comments provided in the review comments
</commit_message>
<xml_diff>
--- a/docs/HLD/hld_temperature_monitoring_system.docx
+++ b/docs/HLD/hld_temperature_monitoring_system.docx
@@ -7,6 +7,9 @@
         <w:pStyle w:val="Heading1"/>
       </w:pPr>
       <w:r>
+        <w:t xml:space="preserve">Temperature Monitoring System </w:t>
+      </w:r>
+      <w:r>
         <w:t>High-Level Design (HLD)</w:t>
       </w:r>
     </w:p>
@@ -69,33 +72,297 @@
       <w:r>
         <w:t>The document provides a high-level design overview for a temperature monitoring system.</w:t>
       </w:r>
+      <w:r>
+        <w:t xml:space="preserve"> The temperature monitoring system will read the temperature </w:t>
+      </w:r>
+      <w:proofErr w:type="gramStart"/>
+      <w:r>
+        <w:t>every p</w:t>
+      </w:r>
+      <w:proofErr w:type="gramEnd"/>
+      <w:r>
+        <w:t xml:space="preserve"> second and </w:t>
+      </w:r>
+      <w:r>
+        <w:t>store it in a shared memory. T</w:t>
+      </w:r>
+      <w:r>
+        <w:t xml:space="preserve">hen </w:t>
+      </w:r>
+      <w:r>
+        <w:t xml:space="preserve">it will </w:t>
+      </w:r>
+      <w:r>
+        <w:t>compare it with a predefined temperature threshold level</w:t>
+      </w:r>
+      <w:r>
+        <w:t xml:space="preserve"> of t</w:t>
+      </w:r>
+      <w:r>
+        <w:t>.</w:t>
+      </w:r>
+      <w:r>
+        <w:t xml:space="preserve">      </w:t>
+      </w:r>
+      <w:r>
+        <w:t xml:space="preserve"> An alarm will be activated </w:t>
+      </w:r>
+      <w:proofErr w:type="gramStart"/>
+      <w:r>
+        <w:t>for n</w:t>
+      </w:r>
+      <w:proofErr w:type="gramEnd"/>
+      <w:r>
+        <w:t xml:space="preserve"> second if the measured temperature exceeds the threshold level, otherwise no action will be taken.</w:t>
+      </w:r>
     </w:p>
     <w:p>
-      <w:pPr>
-        <w:pStyle w:val="Heading2"/>
-      </w:pPr>
-      <w:r>
-        <w:t>2. System Overview</w:t>
+      <w:r>
+        <w:t xml:space="preserve">This </w:t>
+      </w:r>
+      <w:r>
+        <w:t xml:space="preserve">design document provides a traceability to the system requirements and provides a foundation for the detailed </w:t>
+      </w:r>
+      <w:r>
+        <w:t>l</w:t>
+      </w:r>
+      <w:r>
+        <w:t>ow-</w:t>
+      </w:r>
+      <w:r>
+        <w:t>l</w:t>
+      </w:r>
+      <w:r>
+        <w:t xml:space="preserve">evel </w:t>
+      </w:r>
+      <w:r>
+        <w:t>d</w:t>
+      </w:r>
+      <w:r>
+        <w:t>esign</w:t>
+      </w:r>
+      <w:r>
+        <w:t>.</w:t>
       </w:r>
     </w:p>
     <w:p>
-      <w:r>
-        <w:t xml:space="preserve"> </w:t>
-      </w:r>
-      <w:r>
-        <w:t>The system continuously monitors the temperature and activates an alarm if the measured temperature exceeds a predefined threshold level.</w:t>
+      <w:pPr>
+        <w:pStyle w:val="Heading2"/>
+      </w:pPr>
+      <w:r>
+        <w:t>2. System Overview</w:t>
       </w:r>
     </w:p>
     <w:p>
       <w:r>
+        <w:t xml:space="preserve"> </w:t>
+      </w:r>
+      <w:r>
+        <w:t xml:space="preserve">The system monitors the temperature </w:t>
+      </w:r>
+      <w:r>
+        <w:t xml:space="preserve">in every p second </w:t>
+      </w:r>
+      <w:r>
+        <w:t xml:space="preserve">and activates an alarm </w:t>
+      </w:r>
+      <w:r>
+        <w:t xml:space="preserve">for n </w:t>
+      </w:r>
+      <w:proofErr w:type="gramStart"/>
+      <w:r>
+        <w:t>second</w:t>
+      </w:r>
+      <w:proofErr w:type="gramEnd"/>
+      <w:r>
+        <w:t xml:space="preserve"> </w:t>
+      </w:r>
+      <w:r>
+        <w:t>if the measured temperature exceeds a predefined threshold level</w:t>
+      </w:r>
+      <w:r>
+        <w:t xml:space="preserve"> otherwise no action will be taken</w:t>
+      </w:r>
+      <w:r>
+        <w:t>.</w:t>
+      </w:r>
+    </w:p>
+    <w:p>
+      <w:r>
+        <w:t xml:space="preserve">Key components in the system </w:t>
+      </w:r>
+      <w:proofErr w:type="gramStart"/>
+      <w:r>
+        <w:t>are</w:t>
+      </w:r>
+      <w:r>
+        <w:t xml:space="preserve"> :</w:t>
+      </w:r>
+      <w:proofErr w:type="gramEnd"/>
+    </w:p>
+    <w:p>
+      <w:pPr>
+        <w:pStyle w:val="ListParagraph"/>
+        <w:numPr>
+          <w:ilvl w:val="0"/>
+          <w:numId w:val="21"/>
+        </w:numPr>
+      </w:pPr>
+      <w:r>
+        <w:t>Sensor module</w:t>
+      </w:r>
+      <w:r>
+        <w:br/>
+        <w:t xml:space="preserve">The sensor module will read the output from sensor and convert it to the proper output format based on the conversion rules of the sensor. But as of </w:t>
+      </w:r>
+      <w:proofErr w:type="gramStart"/>
+      <w:r>
+        <w:t>now as</w:t>
+      </w:r>
+      <w:proofErr w:type="gramEnd"/>
+      <w:r>
+        <w:t xml:space="preserve"> we are designing the sensor module to </w:t>
+      </w:r>
+      <w:proofErr w:type="gramStart"/>
+      <w:r>
+        <w:t>return</w:t>
+      </w:r>
+      <w:proofErr w:type="gramEnd"/>
+      <w:r>
+        <w:t xml:space="preserve"> a random value </w:t>
+      </w:r>
+      <w:proofErr w:type="gramStart"/>
+      <w:r>
+        <w:t>with in</w:t>
+      </w:r>
+      <w:proofErr w:type="gramEnd"/>
+      <w:r>
+        <w:t xml:space="preserve"> the range of sensor output level </w:t>
+      </w:r>
+      <w:proofErr w:type="spellStart"/>
+      <w:r>
         <w:rPr>
-          <w:noProof/>
+          <w:i/>
+          <w:iCs/>
+        </w:rPr>
+        <w:t>Rmin</w:t>
+      </w:r>
+      <w:proofErr w:type="spellEnd"/>
+      <w:r>
+        <w:rPr>
+          <w:i/>
+          <w:iCs/>
+        </w:rPr>
+        <w:t xml:space="preserve"> and </w:t>
+      </w:r>
+      <w:proofErr w:type="spellStart"/>
+      <w:r>
+        <w:rPr>
+          <w:i/>
+          <w:iCs/>
+        </w:rPr>
+        <w:t>Rmax</w:t>
+      </w:r>
+      <w:proofErr w:type="spellEnd"/>
+      <w:r>
+        <w:rPr>
+          <w:i/>
+          <w:iCs/>
+        </w:rPr>
+        <w:t>.</w:t>
+      </w:r>
+    </w:p>
+    <w:p>
+      <w:pPr>
+        <w:pStyle w:val="ListParagraph"/>
+      </w:pPr>
+    </w:p>
+    <w:p>
+      <w:pPr>
+        <w:pStyle w:val="ListParagraph"/>
+        <w:numPr>
+          <w:ilvl w:val="0"/>
+          <w:numId w:val="21"/>
+        </w:numPr>
+      </w:pPr>
+      <w:r>
+        <w:rPr>
+          <w:i/>
+          <w:iCs/>
+        </w:rPr>
+        <w:t>Temperature monitoring module</w:t>
+      </w:r>
+      <w:r>
+        <w:rPr>
+          <w:i/>
+          <w:iCs/>
+        </w:rPr>
+        <w:br/>
+        <w:t>The module will read the sensor data in every p second</w:t>
+      </w:r>
+      <w:r>
+        <w:rPr>
+          <w:i/>
+          <w:iCs/>
+        </w:rPr>
+        <w:t xml:space="preserve"> and then save the data in a shared memory</w:t>
+      </w:r>
+    </w:p>
+    <w:p>
+      <w:pPr>
+        <w:pStyle w:val="ListParagraph"/>
+      </w:pPr>
+    </w:p>
+    <w:p>
+      <w:pPr>
+        <w:pStyle w:val="ListParagraph"/>
+        <w:numPr>
+          <w:ilvl w:val="0"/>
+          <w:numId w:val="21"/>
+        </w:numPr>
+      </w:pPr>
+      <w:r>
+        <w:t>Alarm manager module</w:t>
+      </w:r>
+      <w:r>
+        <w:br/>
+        <w:t xml:space="preserve">The module will read the current temperature value from the shared memory and then compares it with a predefined threshold level t. An alarm will be activated for n seconds if the measured temperature is above the threshold level. </w:t>
+      </w:r>
+      <w:r>
+        <w:t>Otherwise,</w:t>
+      </w:r>
+      <w:r>
+        <w:t xml:space="preserve"> no action will be taken.</w:t>
+      </w:r>
+    </w:p>
+    <w:p>
+      <w:pPr>
+        <w:pStyle w:val="ListParagraph"/>
+      </w:pPr>
+    </w:p>
+    <w:p/>
+    <w:p>
+      <w:r>
+        <w:lastRenderedPageBreak/>
+        <w:t>High-level architecture diagram</w:t>
+      </w:r>
+    </w:p>
+    <w:p/>
+    <w:p>
+      <w:pPr>
+        <w:rPr>
+          <w:lang w:val="en-IN"/>
+        </w:rPr>
+      </w:pPr>
+      <w:r>
+        <w:rPr>
+          <w:lang w:val="en-IN"/>
         </w:rPr>
         <w:drawing>
-          <wp:inline distT="0" distB="0" distL="0" distR="0" wp14:anchorId="762091D6" wp14:editId="4924CFD0">
-            <wp:extent cx="5486400" cy="2666365"/>
-            <wp:effectExtent l="0" t="0" r="0" b="635"/>
-            <wp:docPr id="1622859449" name="Picture 2"/>
+          <wp:inline distT="0" distB="0" distL="0" distR="0" wp14:anchorId="5045C119" wp14:editId="59A71761">
+            <wp:extent cx="5486400" cy="2890520"/>
+            <wp:effectExtent l="0" t="0" r="0" b="5080"/>
+            <wp:docPr id="79811981" name="Picture 2"/>
             <wp:cNvGraphicFramePr>
               <a:graphicFrameLocks xmlns:a="http://schemas.openxmlformats.org/drawingml/2006/main" noChangeAspect="1"/>
             </wp:cNvGraphicFramePr>
@@ -103,23 +370,36 @@
               <a:graphicData uri="http://schemas.openxmlformats.org/drawingml/2006/picture">
                 <pic:pic xmlns:pic="http://schemas.openxmlformats.org/drawingml/2006/picture">
                   <pic:nvPicPr>
-                    <pic:cNvPr id="1622859449" name="Picture 1622859449"/>
-                    <pic:cNvPicPr/>
+                    <pic:cNvPr id="0" name="Picture 6"/>
+                    <pic:cNvPicPr>
+                      <a:picLocks noChangeAspect="1" noChangeArrowheads="1"/>
+                    </pic:cNvPicPr>
                   </pic:nvPicPr>
                   <pic:blipFill>
-                    <a:blip r:embed="rId6"/>
+                    <a:blip r:embed="rId6">
+                      <a:extLst>
+                        <a:ext uri="{28A0092B-C50C-407E-A947-70E740481C1C}">
+                          <a14:useLocalDpi xmlns:a14="http://schemas.microsoft.com/office/drawing/2010/main" val="0"/>
+                        </a:ext>
+                      </a:extLst>
+                    </a:blip>
+                    <a:srcRect/>
                     <a:stretch>
                       <a:fillRect/>
                     </a:stretch>
                   </pic:blipFill>
-                  <pic:spPr>
+                  <pic:spPr bwMode="auto">
                     <a:xfrm>
                       <a:off x="0" y="0"/>
-                      <a:ext cx="5486400" cy="2666365"/>
+                      <a:ext cx="5486400" cy="2890520"/>
                     </a:xfrm>
                     <a:prstGeom prst="rect">
                       <a:avLst/>
                     </a:prstGeom>
+                    <a:noFill/>
+                    <a:ln>
+                      <a:noFill/>
+                    </a:ln>
                   </pic:spPr>
                 </pic:pic>
               </a:graphicData>
@@ -128,31 +408,392 @@
         </w:drawing>
       </w:r>
     </w:p>
+    <w:p/>
     <w:p>
       <w:pPr>
         <w:pStyle w:val="Heading2"/>
       </w:pPr>
+      <w:r>
+        <w:t>3. Software Architecture</w:t>
+      </w:r>
     </w:p>
     <w:p>
-      <w:pPr>
-        <w:pStyle w:val="Heading2"/>
-      </w:pPr>
-      <w:r>
-        <w:t>3. Software Architecture</w:t>
+      <w:r>
+        <w:t xml:space="preserve"> </w:t>
+      </w:r>
+      <w:r>
+        <w:t xml:space="preserve">The system implementation </w:t>
+      </w:r>
+      <w:r>
+        <w:t xml:space="preserve">consists of </w:t>
+      </w:r>
+      <w:r>
+        <w:t xml:space="preserve">three major modules such as </w:t>
+      </w:r>
+      <w:r>
+        <w:t>sensor,</w:t>
+      </w:r>
+      <w:r>
+        <w:t xml:space="preserve"> t</w:t>
+      </w:r>
+      <w:r>
+        <w:t>emperature monitoring and alarm manager modules</w:t>
+      </w:r>
+      <w:r>
+        <w:t>.</w:t>
       </w:r>
     </w:p>
     <w:p>
+      <w:pPr>
+        <w:pStyle w:val="ListParagraph"/>
+        <w:numPr>
+          <w:ilvl w:val="0"/>
+          <w:numId w:val="24"/>
+        </w:numPr>
+      </w:pPr>
+      <w:r>
+        <w:t>Sensor module:</w:t>
+      </w:r>
+    </w:p>
+    <w:p>
+      <w:pPr>
+        <w:pStyle w:val="ListParagraph"/>
+      </w:pPr>
+      <w:r>
+        <w:t>Sensor module reads the output value from the sensor. In case if</w:t>
+      </w:r>
+      <w:r>
+        <w:t xml:space="preserve"> sensor is not available the output is generated by using random number generation with </w:t>
+      </w:r>
+      <w:r>
+        <w:t>limits</w:t>
+      </w:r>
+      <w:r>
+        <w:t xml:space="preserve"> from </w:t>
+      </w:r>
+      <w:proofErr w:type="spellStart"/>
+      <w:r>
+        <w:rPr>
+          <w:i/>
+          <w:iCs/>
+        </w:rPr>
+        <w:t>Rmin</w:t>
+      </w:r>
+      <w:proofErr w:type="spellEnd"/>
+      <w:r>
+        <w:t xml:space="preserve"> to </w:t>
+      </w:r>
+      <w:proofErr w:type="spellStart"/>
+      <w:r>
+        <w:rPr>
+          <w:i/>
+          <w:iCs/>
+        </w:rPr>
+        <w:t>Rmax</w:t>
+      </w:r>
+      <w:proofErr w:type="spellEnd"/>
+      <w:r>
+        <w:t>.</w:t>
+      </w:r>
+    </w:p>
+    <w:p>
+      <w:pPr>
+        <w:pStyle w:val="ListParagraph"/>
+      </w:pPr>
+      <w:r>
+        <w:br/>
+      </w:r>
+      <w:r>
+        <w:rPr>
+          <w:u w:val="single"/>
+        </w:rPr>
+        <w:t>Data flow:</w:t>
+      </w:r>
+      <w:r>
+        <w:t xml:space="preserve"> Function call from </w:t>
+      </w:r>
+      <w:r>
+        <w:t>temperature monitoring</w:t>
+      </w:r>
+      <w:r>
+        <w:t xml:space="preserve"> to the sensor module will return the measured temperature.</w:t>
+      </w:r>
       <w:r>
         <w:t xml:space="preserve"> </w:t>
       </w:r>
       <w:r>
-        <w:t xml:space="preserve">The system implementation </w:t>
-      </w:r>
-      <w:r>
-        <w:t>consists of sensor, temperature monitoring and alarm manager modules</w:t>
-      </w:r>
-      <w:r>
-        <w:t>. The module to read temperature with a polling frequency (</w:t>
+        <w:t>In case if</w:t>
+      </w:r>
+      <w:r>
+        <w:t xml:space="preserve"> sensor is not available the output is generated by using random number generation with limits from </w:t>
+      </w:r>
+      <w:proofErr w:type="spellStart"/>
+      <w:r>
+        <w:rPr>
+          <w:i/>
+          <w:iCs/>
+        </w:rPr>
+        <w:t>Rmin</w:t>
+      </w:r>
+      <w:proofErr w:type="spellEnd"/>
+      <w:r>
+        <w:t xml:space="preserve"> to </w:t>
+      </w:r>
+      <w:proofErr w:type="spellStart"/>
+      <w:r>
+        <w:rPr>
+          <w:i/>
+          <w:iCs/>
+        </w:rPr>
+        <w:t>Rmax</w:t>
+      </w:r>
+      <w:proofErr w:type="spellEnd"/>
+      <w:r>
+        <w:t>.</w:t>
+      </w:r>
+    </w:p>
+    <w:p>
+      <w:pPr>
+        <w:pStyle w:val="ListParagraph"/>
+      </w:pPr>
+    </w:p>
+    <w:p>
+      <w:pPr>
+        <w:pStyle w:val="ListParagraph"/>
+        <w:ind w:left="1440" w:hanging="720"/>
+      </w:pPr>
+      <w:r>
+        <w:rPr>
+          <w:u w:val="single"/>
+        </w:rPr>
+        <w:t>Control flow:</w:t>
+      </w:r>
+      <w:r>
+        <w:t xml:space="preserve"> The </w:t>
+      </w:r>
+      <w:r>
+        <w:t>temperature monitoring</w:t>
+      </w:r>
+      <w:r>
+        <w:t xml:space="preserve"> will poll the sensor value in every p second</w:t>
+      </w:r>
+    </w:p>
+    <w:p>
+      <w:pPr>
+        <w:pStyle w:val="ListParagraph"/>
+        <w:ind w:left="1440" w:hanging="720"/>
+      </w:pPr>
+    </w:p>
+    <w:p>
+      <w:pPr>
+        <w:pStyle w:val="ListParagraph"/>
+        <w:numPr>
+          <w:ilvl w:val="0"/>
+          <w:numId w:val="24"/>
+        </w:numPr>
+      </w:pPr>
+      <w:r>
+        <w:t>T</w:t>
+      </w:r>
+      <w:r>
+        <w:t>emperature monitoring</w:t>
+      </w:r>
+      <w:r>
+        <w:t xml:space="preserve">: The </w:t>
+      </w:r>
+      <w:r>
+        <w:t>temperature monitoring</w:t>
+      </w:r>
+      <w:r>
+        <w:t xml:space="preserve"> module will </w:t>
+      </w:r>
+      <w:r>
+        <w:t xml:space="preserve">poll the temperature from sensor </w:t>
+      </w:r>
+      <w:r>
+        <w:t>module</w:t>
+      </w:r>
+      <w:r>
+        <w:t xml:space="preserve"> every p second and update the value in a shared memory.</w:t>
+      </w:r>
+    </w:p>
+    <w:p>
+      <w:pPr>
+        <w:pStyle w:val="ListParagraph"/>
+      </w:pPr>
+    </w:p>
+    <w:p>
+      <w:pPr>
+        <w:pStyle w:val="ListParagraph"/>
+      </w:pPr>
+      <w:r>
+        <w:rPr>
+          <w:u w:val="single"/>
+        </w:rPr>
+        <w:t>Data flow:</w:t>
+      </w:r>
+      <w:r>
+        <w:t xml:space="preserve"> The value returned from the sensor module while calling the function to read the temperature will be stored in a shared memory.</w:t>
+      </w:r>
+    </w:p>
+    <w:p>
+      <w:pPr>
+        <w:pStyle w:val="ListParagraph"/>
+      </w:pPr>
+      <w:r>
+        <w:rPr>
+          <w:u w:val="single"/>
+        </w:rPr>
+        <w:lastRenderedPageBreak/>
+        <w:t>Control flow:</w:t>
+      </w:r>
+      <w:r>
+        <w:t xml:space="preserve"> The temperature monitoring module will poll the sensor data in every p second</w:t>
+      </w:r>
+      <w:r>
+        <w:t>.</w:t>
+      </w:r>
+    </w:p>
+    <w:p>
+      <w:pPr>
+        <w:pStyle w:val="ListParagraph"/>
+      </w:pPr>
+    </w:p>
+    <w:p>
+      <w:pPr>
+        <w:pStyle w:val="ListParagraph"/>
+        <w:numPr>
+          <w:ilvl w:val="0"/>
+          <w:numId w:val="24"/>
+        </w:numPr>
+      </w:pPr>
+      <w:r>
+        <w:t xml:space="preserve">Alarm management </w:t>
+      </w:r>
+      <w:r>
+        <w:t>module:</w:t>
+      </w:r>
+      <w:r>
+        <w:t xml:space="preserve"> The alarm management module will read the </w:t>
+      </w:r>
+      <w:r>
+        <w:t xml:space="preserve">updated temperature value from the shared memory, then compare it with the threshold value t. If the </w:t>
+      </w:r>
+      <w:r>
+        <w:t xml:space="preserve">measured temperature is greater than the threshold level, then the alarm will be </w:t>
+      </w:r>
+      <w:proofErr w:type="gramStart"/>
+      <w:r>
+        <w:t>activated for</w:t>
+      </w:r>
+      <w:proofErr w:type="gramEnd"/>
+      <w:r>
+        <w:t xml:space="preserve"> </w:t>
+      </w:r>
+      <w:proofErr w:type="gramStart"/>
+      <w:r>
+        <w:t>n seconds</w:t>
+      </w:r>
+      <w:proofErr w:type="gramEnd"/>
+      <w:r>
+        <w:t>. Otherwise, no action will be taken.</w:t>
+      </w:r>
+    </w:p>
+    <w:p>
+      <w:pPr>
+        <w:pStyle w:val="ListParagraph"/>
+      </w:pPr>
+    </w:p>
+    <w:p>
+      <w:pPr>
+        <w:pStyle w:val="ListParagraph"/>
+      </w:pPr>
+      <w:r>
+        <w:rPr>
+          <w:u w:val="single"/>
+        </w:rPr>
+        <w:t>Data flow:</w:t>
+      </w:r>
+      <w:r>
+        <w:t xml:space="preserve"> The alarm management module will read the temperature value by reading the shared memory which is being updated by the temperature monitoring module.</w:t>
+      </w:r>
+    </w:p>
+    <w:p>
+      <w:pPr>
+        <w:pStyle w:val="ListParagraph"/>
+      </w:pPr>
+    </w:p>
+    <w:p>
+      <w:pPr>
+        <w:pStyle w:val="ListParagraph"/>
+      </w:pPr>
+      <w:r>
+        <w:rPr>
+          <w:u w:val="single"/>
+        </w:rPr>
+        <w:t>Control flow:</w:t>
+      </w:r>
+      <w:r>
+        <w:t xml:space="preserve"> The alarm management module will compare the temperature value read from the shared memory with the predefined threshold level of t. </w:t>
+      </w:r>
+      <w:r>
+        <w:t xml:space="preserve">If the measured temperature is greater than the threshold level, then the alarm will be </w:t>
+      </w:r>
+      <w:proofErr w:type="gramStart"/>
+      <w:r>
+        <w:t>activated for</w:t>
+      </w:r>
+      <w:proofErr w:type="gramEnd"/>
+      <w:r>
+        <w:t xml:space="preserve"> </w:t>
+      </w:r>
+      <w:proofErr w:type="gramStart"/>
+      <w:r>
+        <w:t>n seconds</w:t>
+      </w:r>
+      <w:proofErr w:type="gramEnd"/>
+      <w:r>
+        <w:t>. Otherwise, no action will be taken.</w:t>
+      </w:r>
+    </w:p>
+    <w:p>
+      <w:pPr>
+        <w:pStyle w:val="ListParagraph"/>
+        <w:ind w:left="1440"/>
+      </w:pPr>
+    </w:p>
+    <w:p>
+      <w:pPr>
+        <w:pStyle w:val="ListParagraph"/>
+        <w:numPr>
+          <w:ilvl w:val="0"/>
+          <w:numId w:val="26"/>
+        </w:numPr>
+      </w:pPr>
+      <w:r>
+        <w:t xml:space="preserve">Interactions between the </w:t>
+      </w:r>
+      <w:proofErr w:type="gramStart"/>
+      <w:r>
+        <w:t>modules :</w:t>
+      </w:r>
+      <w:proofErr w:type="gramEnd"/>
+      <w:r>
+        <w:t xml:space="preserve"> </w:t>
+      </w:r>
+    </w:p>
+    <w:p>
+      <w:pPr>
+        <w:pStyle w:val="ListParagraph"/>
+      </w:pPr>
+      <w:r>
+        <w:t xml:space="preserve">The </w:t>
+      </w:r>
+      <w:r>
+        <w:t>temperature monitoring module will read the t</w:t>
+      </w:r>
+      <w:r>
+        <w:t>emperature with a polling frequency (</w:t>
       </w:r>
       <w:r>
         <w:rPr>
@@ -172,7 +813,215 @@
         <w:t>p</w:t>
       </w:r>
       <w:r>
-        <w:t xml:space="preserve"> seconds and another module to compare the measured temperature with the threshold level (</w:t>
+        <w:t xml:space="preserve"> seconds </w:t>
+      </w:r>
+      <w:r>
+        <w:t xml:space="preserve">by making a corresponding function call to the sensor module. The sensor module will return the current temperature and the </w:t>
+      </w:r>
+      <w:r>
+        <w:t>temperature monitoring module</w:t>
+      </w:r>
+      <w:r>
+        <w:t xml:space="preserve"> then save that value into a shared memory. </w:t>
+      </w:r>
+    </w:p>
+    <w:p>
+      <w:pPr>
+        <w:pStyle w:val="ListParagraph"/>
+      </w:pPr>
+    </w:p>
+    <w:p>
+      <w:pPr>
+        <w:pStyle w:val="ListParagraph"/>
+      </w:pPr>
+      <w:r>
+        <w:t xml:space="preserve">The alarm manager module reads the temperature value updated by the </w:t>
+      </w:r>
+      <w:r>
+        <w:t>temperature monitoring module</w:t>
+      </w:r>
+      <w:r>
+        <w:t xml:space="preserve"> by reading the shared memory. Then it compares the temperature value with the threshold value t. </w:t>
+      </w:r>
+      <w:r>
+        <w:t xml:space="preserve">If the measured temperature is greater than the threshold level, then the alarm will be </w:t>
+      </w:r>
+      <w:proofErr w:type="gramStart"/>
+      <w:r>
+        <w:t>activated for</w:t>
+      </w:r>
+      <w:proofErr w:type="gramEnd"/>
+      <w:r>
+        <w:t xml:space="preserve"> </w:t>
+      </w:r>
+      <w:proofErr w:type="gramStart"/>
+      <w:r>
+        <w:t>n seconds</w:t>
+      </w:r>
+      <w:proofErr w:type="gramEnd"/>
+      <w:r>
+        <w:t>. Otherwise, no action will be taken.</w:t>
+      </w:r>
+    </w:p>
+    <w:p>
+      <w:pPr>
+        <w:spacing w:after="160" w:line="278" w:lineRule="auto"/>
+        <w:ind w:left="720"/>
+      </w:pPr>
+      <w:r>
+        <w:t>Sensor</w:t>
+      </w:r>
+      <w:r>
+        <w:t xml:space="preserve"> module</w:t>
+      </w:r>
+      <w:r>
+        <w:t>: Handles communication with the temperature sensor.</w:t>
+      </w:r>
+    </w:p>
+    <w:p>
+      <w:pPr>
+        <w:spacing w:after="160" w:line="278" w:lineRule="auto"/>
+        <w:ind w:left="720"/>
+      </w:pPr>
+      <w:r>
+        <w:t>Temperature management module:</w:t>
+      </w:r>
+      <w:r>
+        <w:t xml:space="preserve"> </w:t>
+      </w:r>
+      <w:r>
+        <w:t>Read the temperature value in every p second and update the value to the shared memory.</w:t>
+      </w:r>
+    </w:p>
+    <w:p>
+      <w:pPr>
+        <w:spacing w:after="160" w:line="278" w:lineRule="auto"/>
+        <w:ind w:left="720"/>
+      </w:pPr>
+      <w:r>
+        <w:t xml:space="preserve">Alarm manager </w:t>
+      </w:r>
+      <w:proofErr w:type="gramStart"/>
+      <w:r>
+        <w:t>module :</w:t>
+      </w:r>
+      <w:proofErr w:type="gramEnd"/>
+      <w:r>
+        <w:t xml:space="preserve"> Access the temperature value by reading the shared memory then compare it with the threshold level and activate an alarm for n second if and only if the temperature exceeds the threshold level.</w:t>
+      </w:r>
+    </w:p>
+    <w:p>
+      <w:pPr>
+        <w:pStyle w:val="Heading2"/>
+      </w:pPr>
+      <w:r>
+        <w:t>4. Module Descriptions</w:t>
+      </w:r>
+    </w:p>
+    <w:p>
+      <w:pPr>
+        <w:pStyle w:val="ListParagraph"/>
+        <w:numPr>
+          <w:ilvl w:val="0"/>
+          <w:numId w:val="12"/>
+        </w:numPr>
+      </w:pPr>
+      <w:r>
+        <w:t xml:space="preserve">Sensor module: </w:t>
+      </w:r>
+      <w:r>
+        <w:t>Reads temperature values from hardware</w:t>
+      </w:r>
+    </w:p>
+    <w:p>
+      <w:pPr>
+        <w:pStyle w:val="ListParagraph"/>
+        <w:numPr>
+          <w:ilvl w:val="0"/>
+          <w:numId w:val="12"/>
+        </w:numPr>
+      </w:pPr>
+      <w:r>
+        <w:t xml:space="preserve">Temperature </w:t>
+      </w:r>
+      <w:r>
+        <w:t xml:space="preserve">monitoring </w:t>
+      </w:r>
+      <w:r>
+        <w:t>module:</w:t>
+      </w:r>
+      <w:r>
+        <w:t xml:space="preserve"> The module will read the temperature in every p </w:t>
+      </w:r>
+      <w:r>
+        <w:t>second</w:t>
+      </w:r>
+      <w:r>
+        <w:t>. The expected temperature output is with the range of 0 (</w:t>
+      </w:r>
+      <w:proofErr w:type="spellStart"/>
+      <w:r>
+        <w:rPr>
+          <w:i/>
+          <w:iCs/>
+        </w:rPr>
+        <w:t>Rmin</w:t>
+      </w:r>
+      <w:proofErr w:type="spellEnd"/>
+      <w:r>
+        <w:t>) to 100 (</w:t>
+      </w:r>
+      <w:proofErr w:type="spellStart"/>
+      <w:r>
+        <w:rPr>
+          <w:i/>
+          <w:iCs/>
+        </w:rPr>
+        <w:t>Rmax</w:t>
+      </w:r>
+      <w:proofErr w:type="spellEnd"/>
+      <w:r>
+        <w:t>)</w:t>
+      </w:r>
+      <w:r>
+        <w:t>.</w:t>
+      </w:r>
+    </w:p>
+    <w:p>
+      <w:pPr>
+        <w:pStyle w:val="ListParagraph"/>
+        <w:numPr>
+          <w:ilvl w:val="0"/>
+          <w:numId w:val="12"/>
+        </w:numPr>
+      </w:pPr>
+      <w:r>
+        <w:t xml:space="preserve">Alarm </w:t>
+      </w:r>
+      <w:r>
+        <w:t xml:space="preserve">manager </w:t>
+      </w:r>
+      <w:r>
+        <w:t>module:</w:t>
+      </w:r>
+      <w:r>
+        <w:t xml:space="preserve"> The module will compare the measured temperature which will be the output of Temperature </w:t>
+      </w:r>
+      <w:r>
+        <w:t xml:space="preserve">monitoring </w:t>
+      </w:r>
+      <w:r>
+        <w:t xml:space="preserve">module and then </w:t>
+      </w:r>
+      <w:r>
+        <w:t>compare</w:t>
+      </w:r>
+      <w:r>
+        <w:t xml:space="preserve"> it with the </w:t>
+      </w:r>
+      <w:r>
+        <w:lastRenderedPageBreak/>
+        <w:t>threshold level (</w:t>
       </w:r>
       <w:r>
         <w:rPr>
@@ -182,266 +1031,6 @@
         <w:t>t</w:t>
       </w:r>
       <w:r>
-        <w:t>) and to activate an alarm if the measured temperature exceeds the threshold.</w:t>
-      </w:r>
-    </w:p>
-    <w:p>
-      <w:pPr>
-        <w:numPr>
-          <w:ilvl w:val="0"/>
-          <w:numId w:val="13"/>
-        </w:numPr>
-        <w:spacing w:after="160" w:line="278" w:lineRule="auto"/>
-      </w:pPr>
-      <w:r>
-        <w:t xml:space="preserve">Sensor </w:t>
-      </w:r>
-      <w:r>
-        <w:t>i</w:t>
-      </w:r>
-      <w:r>
-        <w:t xml:space="preserve">nterface </w:t>
-      </w:r>
-      <w:r>
-        <w:t>l</w:t>
-      </w:r>
-      <w:r>
-        <w:t>ayer: Handles communication with the temperature sensor.</w:t>
-      </w:r>
-    </w:p>
-    <w:p>
-      <w:pPr>
-        <w:numPr>
-          <w:ilvl w:val="0"/>
-          <w:numId w:val="13"/>
-        </w:numPr>
-        <w:spacing w:after="160" w:line="278" w:lineRule="auto"/>
-      </w:pPr>
-      <w:r>
-        <w:t xml:space="preserve">Control </w:t>
-      </w:r>
-      <w:r>
-        <w:t>l</w:t>
-      </w:r>
-      <w:r>
-        <w:t xml:space="preserve">ogic </w:t>
-      </w:r>
-      <w:r>
-        <w:t>l</w:t>
-      </w:r>
-      <w:r>
-        <w:t>ayer: Implements comparison logic and alarm activation.</w:t>
-      </w:r>
-    </w:p>
-    <w:p>
-      <w:pPr>
-        <w:spacing w:after="160" w:line="278" w:lineRule="auto"/>
-        <w:ind w:left="360"/>
-      </w:pPr>
-    </w:p>
-    <w:p>
-      <w:pPr>
-        <w:spacing w:after="160" w:line="278" w:lineRule="auto"/>
-        <w:ind w:left="360"/>
-      </w:pPr>
-    </w:p>
-    <w:p>
-      <w:pPr>
-        <w:spacing w:after="160" w:line="278" w:lineRule="auto"/>
-        <w:ind w:left="360"/>
-      </w:pPr>
-      <w:r>
-        <w:lastRenderedPageBreak/>
-        <w:t>Data flow:</w:t>
-      </w:r>
-    </w:p>
-    <w:p>
-      <w:pPr>
-        <w:spacing w:after="160" w:line="278" w:lineRule="auto"/>
-        <w:ind w:left="720"/>
-      </w:pPr>
-      <w:r>
-        <w:t xml:space="preserve">Sensor → </w:t>
-      </w:r>
-      <w:r>
-        <w:t xml:space="preserve">Read sensor value every p </w:t>
-      </w:r>
-      <w:r>
-        <w:t>second</w:t>
-      </w:r>
-      <w:r>
-        <w:t xml:space="preserve"> and update data</w:t>
-      </w:r>
-      <w:r>
-        <w:t xml:space="preserve"> → Threshold Check → Alarm Trigger.</w:t>
-      </w:r>
-    </w:p>
-    <w:p>
-      <w:pPr>
-        <w:spacing w:after="160" w:line="278" w:lineRule="auto"/>
-        <w:ind w:firstLine="360"/>
-      </w:pPr>
-      <w:r>
-        <w:t>Control flow:</w:t>
-      </w:r>
-    </w:p>
-    <w:p>
-      <w:pPr>
-        <w:pStyle w:val="ListParagraph"/>
-        <w:numPr>
-          <w:ilvl w:val="1"/>
-          <w:numId w:val="17"/>
-        </w:numPr>
-        <w:spacing w:after="160" w:line="278" w:lineRule="auto"/>
-      </w:pPr>
-      <w:r>
-        <w:t>Thread to read temperature</w:t>
-      </w:r>
-      <w:r>
-        <w:t xml:space="preserve"> executes every </w:t>
-      </w:r>
-      <w:r>
-        <w:t>p</w:t>
-      </w:r>
-      <w:r>
-        <w:t xml:space="preserve"> second.</w:t>
-      </w:r>
-    </w:p>
-    <w:p>
-      <w:pPr>
-        <w:pStyle w:val="ListParagraph"/>
-        <w:numPr>
-          <w:ilvl w:val="1"/>
-          <w:numId w:val="17"/>
-        </w:numPr>
-        <w:spacing w:after="160" w:line="278" w:lineRule="auto"/>
-      </w:pPr>
-      <w:r>
-        <w:t xml:space="preserve">If condition met, alarm is activated for </w:t>
-      </w:r>
-      <w:r>
-        <w:t>n</w:t>
-      </w:r>
-      <w:r>
-        <w:t xml:space="preserve"> second</w:t>
-      </w:r>
-      <w:r>
-        <w:t xml:space="preserve"> </w:t>
-      </w:r>
-    </w:p>
-    <w:p>
-      <w:pPr>
-        <w:pStyle w:val="Heading2"/>
-      </w:pPr>
-      <w:r>
-        <w:t>4. Module Descriptions</w:t>
-      </w:r>
-    </w:p>
-    <w:p>
-      <w:pPr>
-        <w:pStyle w:val="ListParagraph"/>
-        <w:numPr>
-          <w:ilvl w:val="0"/>
-          <w:numId w:val="12"/>
-        </w:numPr>
-      </w:pPr>
-      <w:r>
-        <w:t xml:space="preserve">Sensor module: </w:t>
-      </w:r>
-      <w:r>
-        <w:t>Reads temperature values from hardware</w:t>
-      </w:r>
-    </w:p>
-    <w:p>
-      <w:pPr>
-        <w:pStyle w:val="ListParagraph"/>
-        <w:numPr>
-          <w:ilvl w:val="0"/>
-          <w:numId w:val="12"/>
-        </w:numPr>
-      </w:pPr>
-      <w:r>
-        <w:t xml:space="preserve">Temperature </w:t>
-      </w:r>
-      <w:r>
-        <w:t xml:space="preserve">monitoring </w:t>
-      </w:r>
-      <w:r>
-        <w:t>module:</w:t>
-      </w:r>
-      <w:r>
-        <w:t xml:space="preserve"> The module will read the temperature in every p </w:t>
-      </w:r>
-      <w:r>
-        <w:t>second</w:t>
-      </w:r>
-      <w:r>
-        <w:t>. The expected temperature output is with the range of 0 (</w:t>
-      </w:r>
-      <w:r>
-        <w:rPr>
-          <w:i/>
-          <w:iCs/>
-        </w:rPr>
-        <w:t>Rmin</w:t>
-      </w:r>
-      <w:r>
-        <w:t>) to 100 (</w:t>
-      </w:r>
-      <w:r>
-        <w:rPr>
-          <w:i/>
-          <w:iCs/>
-        </w:rPr>
-        <w:t>Rmax</w:t>
-      </w:r>
-      <w:r>
-        <w:t>)</w:t>
-      </w:r>
-      <w:r>
-        <w:t>.</w:t>
-      </w:r>
-    </w:p>
-    <w:p>
-      <w:pPr>
-        <w:pStyle w:val="ListParagraph"/>
-        <w:numPr>
-          <w:ilvl w:val="0"/>
-          <w:numId w:val="12"/>
-        </w:numPr>
-      </w:pPr>
-      <w:r>
-        <w:t xml:space="preserve">Alarm </w:t>
-      </w:r>
-      <w:r>
-        <w:t xml:space="preserve">manager </w:t>
-      </w:r>
-      <w:r>
-        <w:t>module:</w:t>
-      </w:r>
-      <w:r>
-        <w:t xml:space="preserve"> The module will compare the measured temperature which will be the output of Temperature </w:t>
-      </w:r>
-      <w:r>
-        <w:t xml:space="preserve">monitoring </w:t>
-      </w:r>
-      <w:r>
-        <w:t xml:space="preserve">module and then </w:t>
-      </w:r>
-      <w:r>
-        <w:t>compare</w:t>
-      </w:r>
-      <w:r>
-        <w:t xml:space="preserve"> it with the threshold level (</w:t>
-      </w:r>
-      <w:r>
-        <w:rPr>
-          <w:i/>
-          <w:iCs/>
-        </w:rPr>
-        <w:t>t</w:t>
-      </w:r>
-      <w:r>
         <w:t>).</w:t>
       </w:r>
       <w:r>
@@ -466,21 +1055,178 @@
       <w:r>
         <w:t>seconds if the measured temperature exceeds the threshold.</w:t>
       </w:r>
+      <w:r>
+        <w:br/>
+      </w:r>
+      <w:r>
+        <w:br/>
+      </w:r>
+      <w:r>
+        <w:rPr>
+          <w:u w:val="single"/>
+        </w:rPr>
+        <w:t>Key interfaces:</w:t>
+      </w:r>
+      <w:r>
+        <w:t xml:space="preserve"> </w:t>
+      </w:r>
     </w:p>
     <w:p>
       <w:pPr>
-        <w:pStyle w:val="Heading2"/>
-      </w:pPr>
-      <w:r>
-        <w:t>5. Interface Design</w:t>
-      </w:r>
+        <w:pStyle w:val="ListParagraph"/>
+      </w:pPr>
     </w:p>
     <w:p>
-      <w:r>
-        <w:t>Note: Type definitions used</w:t>
-      </w:r>
-      <w:r>
-        <w:t xml:space="preserve"> in this project</w:t>
+      <w:pPr>
+        <w:pStyle w:val="ListParagraph"/>
+        <w:numPr>
+          <w:ilvl w:val="1"/>
+          <w:numId w:val="24"/>
+        </w:numPr>
+      </w:pPr>
+      <w:r>
+        <w:t xml:space="preserve">Sensor </w:t>
+      </w:r>
+      <w:proofErr w:type="gramStart"/>
+      <w:r>
+        <w:t>module :</w:t>
+      </w:r>
+      <w:proofErr w:type="gramEnd"/>
+      <w:r>
+        <w:t xml:space="preserve"> API to read temperature value</w:t>
+      </w:r>
+    </w:p>
+    <w:p>
+      <w:pPr>
+        <w:pStyle w:val="ListParagraph"/>
+        <w:spacing w:after="160" w:line="278" w:lineRule="auto"/>
+        <w:ind w:firstLine="720"/>
+      </w:pPr>
+      <w:r>
+        <w:t xml:space="preserve">uint32 </w:t>
+      </w:r>
+      <w:proofErr w:type="spellStart"/>
+      <w:r>
+        <w:t>sensorReadTemperature</w:t>
+      </w:r>
+      <w:proofErr w:type="spellEnd"/>
+      <w:r>
+        <w:t xml:space="preserve"> </w:t>
+      </w:r>
+      <w:r>
+        <w:t>(</w:t>
+      </w:r>
+      <w:r>
+        <w:t>void</w:t>
+      </w:r>
+      <w:proofErr w:type="gramStart"/>
+      <w:r>
+        <w:t>)</w:t>
+      </w:r>
+      <w:r>
+        <w:t>;</w:t>
+      </w:r>
+      <w:proofErr w:type="gramEnd"/>
+    </w:p>
+    <w:p>
+      <w:pPr>
+        <w:pStyle w:val="ListParagraph"/>
+        <w:spacing w:after="160" w:line="278" w:lineRule="auto"/>
+        <w:ind w:firstLine="720"/>
+      </w:pPr>
+    </w:p>
+    <w:p>
+      <w:pPr>
+        <w:pStyle w:val="ListParagraph"/>
+        <w:numPr>
+          <w:ilvl w:val="1"/>
+          <w:numId w:val="24"/>
+        </w:numPr>
+        <w:spacing w:after="160" w:line="278" w:lineRule="auto"/>
+      </w:pPr>
+      <w:r>
+        <w:t>Temperature monitoring module: API to create thread to poll temperature every p second and update the value to the shared memory.</w:t>
+      </w:r>
+    </w:p>
+    <w:p>
+      <w:pPr>
+        <w:pStyle w:val="ListParagraph"/>
+        <w:spacing w:after="160" w:line="278" w:lineRule="auto"/>
+        <w:ind w:left="1440"/>
+      </w:pPr>
+      <w:r>
+        <w:t xml:space="preserve">bool </w:t>
+      </w:r>
+      <w:proofErr w:type="spellStart"/>
+      <w:r>
+        <w:t>temperatureMonitoringThreadCreate</w:t>
+      </w:r>
+      <w:proofErr w:type="spellEnd"/>
+      <w:r>
+        <w:t xml:space="preserve"> (void</w:t>
+      </w:r>
+      <w:proofErr w:type="gramStart"/>
+      <w:r>
+        <w:t>)</w:t>
+      </w:r>
+      <w:r>
+        <w:t>;</w:t>
+      </w:r>
+      <w:proofErr w:type="gramEnd"/>
+    </w:p>
+    <w:p>
+      <w:pPr>
+        <w:pStyle w:val="ListParagraph"/>
+        <w:spacing w:after="160" w:line="278" w:lineRule="auto"/>
+        <w:ind w:left="1440"/>
+      </w:pPr>
+    </w:p>
+    <w:p>
+      <w:pPr>
+        <w:spacing w:after="160" w:line="278" w:lineRule="auto"/>
+        <w:ind w:left="1440"/>
+      </w:pPr>
+      <w:r>
+        <w:t>Alarm manager module: API to read the temperature value from shared memory and do the comparison with threshold level t and to activate the alarm accordingly.</w:t>
+      </w:r>
+      <w:r>
+        <w:br/>
+        <w:t xml:space="preserve"> bool </w:t>
+      </w:r>
+      <w:proofErr w:type="spellStart"/>
+      <w:r>
+        <w:t>alarmManagerThreadCreate</w:t>
+      </w:r>
+      <w:proofErr w:type="spellEnd"/>
+      <w:r>
+        <w:t xml:space="preserve"> (void</w:t>
+      </w:r>
+      <w:proofErr w:type="gramStart"/>
+      <w:r>
+        <w:t>)</w:t>
+      </w:r>
+      <w:r>
+        <w:t>;</w:t>
+      </w:r>
+      <w:proofErr w:type="gramEnd"/>
+    </w:p>
+    <w:p>
+      <w:pPr>
+        <w:spacing w:after="160" w:line="278" w:lineRule="auto"/>
+        <w:ind w:left="1440"/>
+      </w:pPr>
+    </w:p>
+    <w:p>
+      <w:pPr>
+        <w:pStyle w:val="Heading2"/>
+      </w:pPr>
+      <w:r>
+        <w:t>5. Interface Design</w:t>
+      </w:r>
+    </w:p>
+    <w:p>
+      <w:r>
+        <w:t>Note: Type definitions used in this project</w:t>
       </w:r>
     </w:p>
     <w:tbl>
@@ -658,7 +1404,7 @@
         <w:spacing w:after="160" w:line="278" w:lineRule="auto"/>
       </w:pPr>
       <w:r>
-        <w:t>s</w:t>
+        <w:t>S</w:t>
       </w:r>
       <w:r>
         <w:t>ensor API:</w:t>
@@ -670,25 +1416,21 @@
         <w:ind w:left="720"/>
       </w:pPr>
       <w:r>
-        <w:t>uint32 ucTemperatureValue</w:t>
-      </w:r>
+        <w:t xml:space="preserve">uint32 </w:t>
+      </w:r>
+      <w:proofErr w:type="spellStart"/>
+      <w:r>
+        <w:t>sensorReadTemperature</w:t>
+      </w:r>
+      <w:proofErr w:type="spellEnd"/>
       <w:r>
         <w:t xml:space="preserve"> </w:t>
       </w:r>
       <w:r>
-        <w:t>sensorReadTemperature</w:t>
-      </w:r>
-      <w:r>
-        <w:t xml:space="preserve"> </w:t>
-      </w:r>
-      <w:r>
         <w:t>(</w:t>
       </w:r>
       <w:r>
-        <w:t>uint8</w:t>
-      </w:r>
-      <w:r>
-        <w:t xml:space="preserve"> ucTemperatureSensorPin</w:t>
+        <w:t>void</w:t>
       </w:r>
       <w:r>
         <w:t xml:space="preserve">) </w:t>
@@ -700,16 +1442,18 @@
         <w:ind w:left="720"/>
       </w:pPr>
       <w:r>
-        <w:t xml:space="preserve">It will receive the pin to which the sensor is connected as input argument. </w:t>
-      </w:r>
-    </w:p>
-    <w:p>
-      <w:pPr>
-        <w:spacing w:after="160" w:line="278" w:lineRule="auto"/>
-        <w:ind w:left="720"/>
-      </w:pPr>
-      <w:r>
-        <w:t xml:space="preserve">And will return the measured temperature  </w:t>
+        <w:t>It</w:t>
+      </w:r>
+      <w:r>
+        <w:t xml:space="preserve"> will </w:t>
+      </w:r>
+      <w:proofErr w:type="gramStart"/>
+      <w:r>
+        <w:t>return</w:t>
+      </w:r>
+      <w:proofErr w:type="gramEnd"/>
+      <w:r>
+        <w:t xml:space="preserve"> the measured temperature  </w:t>
       </w:r>
     </w:p>
     <w:p>
@@ -721,7 +1465,16 @@
         <w:spacing w:after="160" w:line="278" w:lineRule="auto"/>
       </w:pPr>
       <w:r>
-        <w:t>temperatureMonitoring</w:t>
+        <w:t>T</w:t>
+      </w:r>
+      <w:r>
+        <w:t>emperature</w:t>
+      </w:r>
+      <w:r>
+        <w:t xml:space="preserve"> </w:t>
+      </w:r>
+      <w:r>
+        <w:t>Monitoring</w:t>
       </w:r>
       <w:r>
         <w:t xml:space="preserve"> </w:t>
@@ -738,9 +1491,11 @@
       <w:r>
         <w:t xml:space="preserve">bool </w:t>
       </w:r>
+      <w:proofErr w:type="spellStart"/>
       <w:r>
         <w:t>temperatureMonitoringThreadCreate</w:t>
       </w:r>
+      <w:proofErr w:type="spellEnd"/>
       <w:r>
         <w:t xml:space="preserve"> (void)</w:t>
       </w:r>
@@ -862,7 +1617,16 @@
         <w:spacing w:after="160" w:line="278" w:lineRule="auto"/>
       </w:pPr>
       <w:r>
-        <w:t>alarmManager</w:t>
+        <w:t>A</w:t>
+      </w:r>
+      <w:r>
+        <w:t>larm</w:t>
+      </w:r>
+      <w:r>
+        <w:t xml:space="preserve"> </w:t>
+      </w:r>
+      <w:r>
+        <w:t>Manager</w:t>
       </w:r>
       <w:r>
         <w:t xml:space="preserve"> </w:t>
@@ -879,15 +1643,22 @@
       <w:r>
         <w:t xml:space="preserve">bool </w:t>
       </w:r>
+      <w:proofErr w:type="spellStart"/>
       <w:r>
         <w:t>alarmManagerThreadCreate</w:t>
       </w:r>
-      <w:r>
-        <w:t xml:space="preserve"> </w:t>
-      </w:r>
-      <w:r>
-        <w:t>(void)</w:t>
-      </w:r>
+      <w:proofErr w:type="spellEnd"/>
+      <w:r>
+        <w:t xml:space="preserve"> (void</w:t>
+      </w:r>
+      <w:proofErr w:type="gramStart"/>
+      <w:r>
+        <w:t>)</w:t>
+      </w:r>
+      <w:r>
+        <w:t>;</w:t>
+      </w:r>
+      <w:proofErr w:type="gramEnd"/>
     </w:p>
     <w:p>
       <w:pPr>
@@ -1018,7 +1789,7 @@
         <w:spacing w:after="160" w:line="278" w:lineRule="auto"/>
       </w:pPr>
       <w:r>
-        <w:t>s</w:t>
+        <w:t>S</w:t>
       </w:r>
       <w:r>
         <w:t>ensor</w:t>
@@ -1039,7 +1810,16 @@
         <w:spacing w:after="160" w:line="278" w:lineRule="auto"/>
       </w:pPr>
       <w:r>
-        <w:t>temperatureMonitoring</w:t>
+        <w:t>T</w:t>
+      </w:r>
+      <w:r>
+        <w:t>emperature</w:t>
+      </w:r>
+      <w:r>
+        <w:t xml:space="preserve"> m</w:t>
+      </w:r>
+      <w:r>
+        <w:t>onitoring</w:t>
       </w:r>
       <w:r>
         <w:t xml:space="preserve"> </w:t>
@@ -1048,7 +1828,15 @@
         <w:t xml:space="preserve">module </w:t>
       </w:r>
       <w:r>
-        <w:t xml:space="preserve">reads the temperature every p seconds and </w:t>
+        <w:t xml:space="preserve">reads the temperature every p </w:t>
+      </w:r>
+      <w:proofErr w:type="gramStart"/>
+      <w:r>
+        <w:t>seconds</w:t>
+      </w:r>
+      <w:proofErr w:type="gramEnd"/>
+      <w:r>
+        <w:t xml:space="preserve"> and </w:t>
       </w:r>
       <w:r>
         <w:t>saves</w:t>
@@ -1066,13 +1854,38 @@
         <w:spacing w:after="160" w:line="278" w:lineRule="auto"/>
       </w:pPr>
       <w:r>
-        <w:t>alarmManager</w:t>
+        <w:t>A</w:t>
+      </w:r>
+      <w:r>
+        <w:t>larm</w:t>
+      </w:r>
+      <w:r>
+        <w:t xml:space="preserve"> m</w:t>
+      </w:r>
+      <w:r>
+        <w:t>anager</w:t>
       </w:r>
       <w:r>
         <w:t xml:space="preserve"> </w:t>
       </w:r>
       <w:r>
-        <w:t xml:space="preserve">reads the temperature from the shared memory and then compares it to the threshold and activate an alarm for n second if condition met </w:t>
+        <w:t xml:space="preserve">reads the temperature from the shared memory and then compares it to the threshold and </w:t>
+      </w:r>
+      <w:proofErr w:type="gramStart"/>
+      <w:r>
+        <w:t>activate</w:t>
+      </w:r>
+      <w:proofErr w:type="gramEnd"/>
+      <w:r>
+        <w:t xml:space="preserve"> an alarm for n </w:t>
+      </w:r>
+      <w:proofErr w:type="gramStart"/>
+      <w:r>
+        <w:t>second</w:t>
+      </w:r>
+      <w:proofErr w:type="gramEnd"/>
+      <w:r>
+        <w:t xml:space="preserve"> if condition met </w:t>
       </w:r>
     </w:p>
     <w:p/>
@@ -1156,7 +1969,103 @@
         <w:rPr>
           <w:rFonts w:cs="Calibri"/>
         </w:rPr>
-        <w:t>The measured temperature range is expected to be within a range of Rmin to Rmax. In which Rmin is assumed to be 0 and Rmax as 100. The alarm must be activated if and only if the measured temperature exceeds the threshold level. The temperature threshold level (t) assumed as 60.</w:t>
+        <w:t xml:space="preserve">The measured temperature range is expected to be within a range of </w:t>
+      </w:r>
+      <w:proofErr w:type="spellStart"/>
+      <w:r>
+        <w:rPr>
+          <w:rFonts w:cs="Calibri"/>
+        </w:rPr>
+        <w:t>Rmin</w:t>
+      </w:r>
+      <w:proofErr w:type="spellEnd"/>
+      <w:r>
+        <w:rPr>
+          <w:rFonts w:cs="Calibri"/>
+        </w:rPr>
+        <w:t xml:space="preserve"> to </w:t>
+      </w:r>
+      <w:proofErr w:type="spellStart"/>
+      <w:r>
+        <w:rPr>
+          <w:rFonts w:cs="Calibri"/>
+        </w:rPr>
+        <w:t>Rmax</w:t>
+      </w:r>
+      <w:proofErr w:type="spellEnd"/>
+      <w:r>
+        <w:rPr>
+          <w:rFonts w:cs="Calibri"/>
+        </w:rPr>
+        <w:t xml:space="preserve">. In which </w:t>
+      </w:r>
+      <w:proofErr w:type="spellStart"/>
+      <w:r>
+        <w:rPr>
+          <w:rFonts w:cs="Calibri"/>
+        </w:rPr>
+        <w:t>Rmin</w:t>
+      </w:r>
+      <w:proofErr w:type="spellEnd"/>
+      <w:r>
+        <w:rPr>
+          <w:rFonts w:cs="Calibri"/>
+        </w:rPr>
+        <w:t xml:space="preserve"> is assumed to be 0 and </w:t>
+      </w:r>
+      <w:proofErr w:type="spellStart"/>
+      <w:r>
+        <w:rPr>
+          <w:rFonts w:cs="Calibri"/>
+        </w:rPr>
+        <w:t>Rmax</w:t>
+      </w:r>
+      <w:proofErr w:type="spellEnd"/>
+      <w:r>
+        <w:rPr>
+          <w:rFonts w:cs="Calibri"/>
+        </w:rPr>
+        <w:t xml:space="preserve"> as 100. The alarm must be activated if and only if the measured temperature exceeds the threshold level. The temperature threshold level (t) assumed as 60.</w:t>
+      </w:r>
+      <w:r>
+        <w:rPr>
+          <w:rFonts w:cs="Calibri"/>
+        </w:rPr>
+        <w:t xml:space="preserve"> If the </w:t>
+      </w:r>
+      <w:r>
+        <w:rPr>
+          <w:rFonts w:cs="Calibri"/>
+        </w:rPr>
+        <w:t xml:space="preserve">sensor is not responding to the call to read data due to hardware </w:t>
+      </w:r>
+      <w:proofErr w:type="gramStart"/>
+      <w:r>
+        <w:rPr>
+          <w:rFonts w:cs="Calibri"/>
+        </w:rPr>
+        <w:t>error</w:t>
+      </w:r>
+      <w:proofErr w:type="gramEnd"/>
+      <w:r>
+        <w:rPr>
+          <w:rFonts w:cs="Calibri"/>
+        </w:rPr>
+        <w:t xml:space="preserve"> then it will return zero indicating </w:t>
+      </w:r>
+      <w:proofErr w:type="gramStart"/>
+      <w:r>
+        <w:rPr>
+          <w:rFonts w:cs="Calibri"/>
+        </w:rPr>
+        <w:t>an</w:t>
+      </w:r>
+      <w:proofErr w:type="gramEnd"/>
+      <w:r>
+        <w:rPr>
+          <w:rFonts w:cs="Calibri"/>
+        </w:rPr>
+        <w:t xml:space="preserve"> hardware errors, else return true.</w:t>
       </w:r>
     </w:p>
     <w:p>
@@ -1184,7 +2093,33 @@
         <w:spacing w:after="160" w:line="278" w:lineRule="auto"/>
       </w:pPr>
       <w:r>
-        <w:t xml:space="preserve">Requirement: Read temperature every </w:t>
+        <w:t>Requirement</w:t>
+      </w:r>
+      <w:r>
+        <w:t xml:space="preserve"> mentioned in SRS section </w:t>
+      </w:r>
+      <w:bookmarkStart w:id="0" w:name="_Toc138066810"/>
+      <w:r>
+        <w:rPr>
+          <w:lang w:val="en-IN"/>
+        </w:rPr>
+        <w:t>2.1 Functional requirement 1</w:t>
+      </w:r>
+      <w:bookmarkEnd w:id="0"/>
+      <w:r>
+        <w:rPr>
+          <w:lang w:val="en-IN"/>
+        </w:rPr>
+        <w:t>:</w:t>
+      </w:r>
+    </w:p>
+    <w:p>
+      <w:pPr>
+        <w:spacing w:after="160" w:line="278" w:lineRule="auto"/>
+        <w:ind w:left="720"/>
+      </w:pPr>
+      <w:r>
+        <w:t xml:space="preserve"> Read temperature every </w:t>
       </w:r>
       <w:r>
         <w:t>p</w:t>
@@ -1193,7 +2128,16 @@
         <w:t xml:space="preserve"> second → </w:t>
       </w:r>
       <w:r>
-        <w:t>temperatureMonitoring</w:t>
+        <w:t>t</w:t>
+      </w:r>
+      <w:r>
+        <w:t>emperature</w:t>
+      </w:r>
+      <w:r>
+        <w:t xml:space="preserve"> m</w:t>
+      </w:r>
+      <w:r>
+        <w:t>onitoring</w:t>
       </w:r>
       <w:r>
         <w:t xml:space="preserve"> module</w:t>
@@ -1208,7 +2152,49 @@
         <w:spacing w:after="160" w:line="278" w:lineRule="auto"/>
       </w:pPr>
       <w:r>
-        <w:t xml:space="preserve">Requirement: Compare </w:t>
+        <w:t>Requirement</w:t>
+      </w:r>
+      <w:r>
+        <w:t xml:space="preserve"> mentioned in SRS section </w:t>
+      </w:r>
+      <w:r>
+        <w:rPr>
+          <w:lang w:val="en-IN"/>
+        </w:rPr>
+        <w:t>2.</w:t>
+      </w:r>
+      <w:r>
+        <w:rPr>
+          <w:lang w:val="en-IN"/>
+        </w:rPr>
+        <w:t>2</w:t>
+      </w:r>
+      <w:r>
+        <w:rPr>
+          <w:lang w:val="en-IN"/>
+        </w:rPr>
+        <w:t xml:space="preserve"> Functional requirement </w:t>
+      </w:r>
+      <w:r>
+        <w:rPr>
+          <w:lang w:val="en-IN"/>
+        </w:rPr>
+        <w:t>2</w:t>
+      </w:r>
+      <w:r>
+        <w:rPr>
+          <w:lang w:val="en-IN"/>
+        </w:rPr>
+        <w:t>:</w:t>
+      </w:r>
+    </w:p>
+    <w:p>
+      <w:pPr>
+        <w:spacing w:after="160" w:line="278" w:lineRule="auto"/>
+        <w:ind w:left="720"/>
+      </w:pPr>
+      <w:r>
+        <w:t xml:space="preserve">Compare </w:t>
       </w:r>
       <w:r>
         <w:t xml:space="preserve">current temperature </w:t>
@@ -1217,7 +2203,13 @@
         <w:t xml:space="preserve">with threshold → </w:t>
       </w:r>
       <w:r>
-        <w:t>temperatureMonitoring</w:t>
+        <w:t>temperature</w:t>
+      </w:r>
+      <w:r>
+        <w:t xml:space="preserve"> m</w:t>
+      </w:r>
+      <w:r>
+        <w:t>onitoring</w:t>
       </w:r>
       <w:r>
         <w:t xml:space="preserve"> m</w:t>
@@ -1235,10 +2227,49 @@
         <w:spacing w:after="160" w:line="278" w:lineRule="auto"/>
       </w:pPr>
       <w:r>
-        <w:t>Requirement:</w:t>
-      </w:r>
-      <w:r>
-        <w:t xml:space="preserve"> If temperature is above </w:t>
+        <w:t>Requirement</w:t>
+      </w:r>
+      <w:r>
+        <w:t xml:space="preserve"> mentioned in SRS section </w:t>
+      </w:r>
+      <w:r>
+        <w:rPr>
+          <w:lang w:val="en-IN"/>
+        </w:rPr>
+        <w:t>2.</w:t>
+      </w:r>
+      <w:r>
+        <w:rPr>
+          <w:lang w:val="en-IN"/>
+        </w:rPr>
+        <w:t>2</w:t>
+      </w:r>
+      <w:r>
+        <w:rPr>
+          <w:lang w:val="en-IN"/>
+        </w:rPr>
+        <w:t xml:space="preserve"> Functional requirement </w:t>
+      </w:r>
+      <w:r>
+        <w:rPr>
+          <w:lang w:val="en-IN"/>
+        </w:rPr>
+        <w:t>2</w:t>
+      </w:r>
+      <w:r>
+        <w:rPr>
+          <w:lang w:val="en-IN"/>
+        </w:rPr>
+        <w:t>:</w:t>
+      </w:r>
+    </w:p>
+    <w:p>
+      <w:pPr>
+        <w:spacing w:after="160" w:line="278" w:lineRule="auto"/>
+        <w:ind w:left="720"/>
+      </w:pPr>
+      <w:r>
+        <w:t xml:space="preserve">If temperature is above </w:t>
       </w:r>
       <w:r>
         <w:t>threshold,</w:t>
@@ -1262,7 +2293,13 @@
         <w:t xml:space="preserve"> second → </w:t>
       </w:r>
       <w:r>
-        <w:t>alarmManager</w:t>
+        <w:t>alarm</w:t>
+      </w:r>
+      <w:r>
+        <w:t xml:space="preserve"> m</w:t>
+      </w:r>
+      <w:r>
+        <w:t>anager</w:t>
       </w:r>
       <w:r>
         <w:t xml:space="preserve"> m</w:t>
@@ -1456,6 +2493,119 @@
     </w:lvl>
   </w:abstractNum>
   <w:abstractNum w:abstractNumId="9" w15:restartNumberingAfterBreak="0">
+    <w:nsid w:val="067C7EED"/>
+    <w:multiLevelType w:val="hybridMultilevel"/>
+    <w:tmpl w:val="2728AD0E"/>
+    <w:lvl w:ilvl="0" w:tplc="40090001">
+      <w:start w:val="1"/>
+      <w:numFmt w:val="bullet"/>
+      <w:lvlText w:val=""/>
+      <w:lvlJc w:val="left"/>
+      <w:pPr>
+        <w:ind w:left="720" w:hanging="360"/>
+      </w:pPr>
+      <w:rPr>
+        <w:rFonts w:ascii="Symbol" w:hAnsi="Symbol" w:hint="default"/>
+      </w:rPr>
+    </w:lvl>
+    <w:lvl w:ilvl="1" w:tplc="40090003" w:tentative="1">
+      <w:start w:val="1"/>
+      <w:numFmt w:val="bullet"/>
+      <w:lvlText w:val="o"/>
+      <w:lvlJc w:val="left"/>
+      <w:pPr>
+        <w:ind w:left="1440" w:hanging="360"/>
+      </w:pPr>
+      <w:rPr>
+        <w:rFonts w:ascii="Courier New" w:hAnsi="Courier New" w:cs="Courier New" w:hint="default"/>
+      </w:rPr>
+    </w:lvl>
+    <w:lvl w:ilvl="2" w:tplc="40090005" w:tentative="1">
+      <w:start w:val="1"/>
+      <w:numFmt w:val="bullet"/>
+      <w:lvlText w:val=""/>
+      <w:lvlJc w:val="left"/>
+      <w:pPr>
+        <w:ind w:left="2160" w:hanging="360"/>
+      </w:pPr>
+      <w:rPr>
+        <w:rFonts w:ascii="Wingdings" w:hAnsi="Wingdings" w:hint="default"/>
+      </w:rPr>
+    </w:lvl>
+    <w:lvl w:ilvl="3" w:tplc="40090001" w:tentative="1">
+      <w:start w:val="1"/>
+      <w:numFmt w:val="bullet"/>
+      <w:lvlText w:val=""/>
+      <w:lvlJc w:val="left"/>
+      <w:pPr>
+        <w:ind w:left="2880" w:hanging="360"/>
+      </w:pPr>
+      <w:rPr>
+        <w:rFonts w:ascii="Symbol" w:hAnsi="Symbol" w:hint="default"/>
+      </w:rPr>
+    </w:lvl>
+    <w:lvl w:ilvl="4" w:tplc="40090003" w:tentative="1">
+      <w:start w:val="1"/>
+      <w:numFmt w:val="bullet"/>
+      <w:lvlText w:val="o"/>
+      <w:lvlJc w:val="left"/>
+      <w:pPr>
+        <w:ind w:left="3600" w:hanging="360"/>
+      </w:pPr>
+      <w:rPr>
+        <w:rFonts w:ascii="Courier New" w:hAnsi="Courier New" w:cs="Courier New" w:hint="default"/>
+      </w:rPr>
+    </w:lvl>
+    <w:lvl w:ilvl="5" w:tplc="40090005" w:tentative="1">
+      <w:start w:val="1"/>
+      <w:numFmt w:val="bullet"/>
+      <w:lvlText w:val=""/>
+      <w:lvlJc w:val="left"/>
+      <w:pPr>
+        <w:ind w:left="4320" w:hanging="360"/>
+      </w:pPr>
+      <w:rPr>
+        <w:rFonts w:ascii="Wingdings" w:hAnsi="Wingdings" w:hint="default"/>
+      </w:rPr>
+    </w:lvl>
+    <w:lvl w:ilvl="6" w:tplc="40090001" w:tentative="1">
+      <w:start w:val="1"/>
+      <w:numFmt w:val="bullet"/>
+      <w:lvlText w:val=""/>
+      <w:lvlJc w:val="left"/>
+      <w:pPr>
+        <w:ind w:left="5040" w:hanging="360"/>
+      </w:pPr>
+      <w:rPr>
+        <w:rFonts w:ascii="Symbol" w:hAnsi="Symbol" w:hint="default"/>
+      </w:rPr>
+    </w:lvl>
+    <w:lvl w:ilvl="7" w:tplc="40090003" w:tentative="1">
+      <w:start w:val="1"/>
+      <w:numFmt w:val="bullet"/>
+      <w:lvlText w:val="o"/>
+      <w:lvlJc w:val="left"/>
+      <w:pPr>
+        <w:ind w:left="5760" w:hanging="360"/>
+      </w:pPr>
+      <w:rPr>
+        <w:rFonts w:ascii="Courier New" w:hAnsi="Courier New" w:cs="Courier New" w:hint="default"/>
+      </w:rPr>
+    </w:lvl>
+    <w:lvl w:ilvl="8" w:tplc="40090005" w:tentative="1">
+      <w:start w:val="1"/>
+      <w:numFmt w:val="bullet"/>
+      <w:lvlText w:val=""/>
+      <w:lvlJc w:val="left"/>
+      <w:pPr>
+        <w:ind w:left="6480" w:hanging="360"/>
+      </w:pPr>
+      <w:rPr>
+        <w:rFonts w:ascii="Wingdings" w:hAnsi="Wingdings" w:hint="default"/>
+      </w:rPr>
+    </w:lvl>
+  </w:abstractNum>
+  <w:abstractNum w:abstractNumId="10" w15:restartNumberingAfterBreak="0">
     <w:nsid w:val="0E7425F6"/>
     <w:multiLevelType w:val="hybridMultilevel"/>
     <w:tmpl w:val="ED0217D8"/>
@@ -1568,7 +2718,120 @@
       </w:rPr>
     </w:lvl>
   </w:abstractNum>
-  <w:abstractNum w:abstractNumId="10" w15:restartNumberingAfterBreak="0">
+  <w:abstractNum w:abstractNumId="11" w15:restartNumberingAfterBreak="0">
+    <w:nsid w:val="1784677C"/>
+    <w:multiLevelType w:val="hybridMultilevel"/>
+    <w:tmpl w:val="047A20F0"/>
+    <w:lvl w:ilvl="0" w:tplc="40090003">
+      <w:start w:val="1"/>
+      <w:numFmt w:val="bullet"/>
+      <w:lvlText w:val="o"/>
+      <w:lvlJc w:val="left"/>
+      <w:pPr>
+        <w:ind w:left="720" w:hanging="360"/>
+      </w:pPr>
+      <w:rPr>
+        <w:rFonts w:ascii="Courier New" w:hAnsi="Courier New" w:cs="Courier New" w:hint="default"/>
+      </w:rPr>
+    </w:lvl>
+    <w:lvl w:ilvl="1" w:tplc="40090003">
+      <w:start w:val="1"/>
+      <w:numFmt w:val="bullet"/>
+      <w:lvlText w:val="o"/>
+      <w:lvlJc w:val="left"/>
+      <w:pPr>
+        <w:ind w:left="1440" w:hanging="360"/>
+      </w:pPr>
+      <w:rPr>
+        <w:rFonts w:ascii="Courier New" w:hAnsi="Courier New" w:cs="Courier New" w:hint="default"/>
+      </w:rPr>
+    </w:lvl>
+    <w:lvl w:ilvl="2" w:tplc="40090005" w:tentative="1">
+      <w:start w:val="1"/>
+      <w:numFmt w:val="bullet"/>
+      <w:lvlText w:val=""/>
+      <w:lvlJc w:val="left"/>
+      <w:pPr>
+        <w:ind w:left="2160" w:hanging="360"/>
+      </w:pPr>
+      <w:rPr>
+        <w:rFonts w:ascii="Wingdings" w:hAnsi="Wingdings" w:hint="default"/>
+      </w:rPr>
+    </w:lvl>
+    <w:lvl w:ilvl="3" w:tplc="40090001" w:tentative="1">
+      <w:start w:val="1"/>
+      <w:numFmt w:val="bullet"/>
+      <w:lvlText w:val=""/>
+      <w:lvlJc w:val="left"/>
+      <w:pPr>
+        <w:ind w:left="2880" w:hanging="360"/>
+      </w:pPr>
+      <w:rPr>
+        <w:rFonts w:ascii="Symbol" w:hAnsi="Symbol" w:hint="default"/>
+      </w:rPr>
+    </w:lvl>
+    <w:lvl w:ilvl="4" w:tplc="40090003" w:tentative="1">
+      <w:start w:val="1"/>
+      <w:numFmt w:val="bullet"/>
+      <w:lvlText w:val="o"/>
+      <w:lvlJc w:val="left"/>
+      <w:pPr>
+        <w:ind w:left="3600" w:hanging="360"/>
+      </w:pPr>
+      <w:rPr>
+        <w:rFonts w:ascii="Courier New" w:hAnsi="Courier New" w:cs="Courier New" w:hint="default"/>
+      </w:rPr>
+    </w:lvl>
+    <w:lvl w:ilvl="5" w:tplc="40090005" w:tentative="1">
+      <w:start w:val="1"/>
+      <w:numFmt w:val="bullet"/>
+      <w:lvlText w:val=""/>
+      <w:lvlJc w:val="left"/>
+      <w:pPr>
+        <w:ind w:left="4320" w:hanging="360"/>
+      </w:pPr>
+      <w:rPr>
+        <w:rFonts w:ascii="Wingdings" w:hAnsi="Wingdings" w:hint="default"/>
+      </w:rPr>
+    </w:lvl>
+    <w:lvl w:ilvl="6" w:tplc="40090001" w:tentative="1">
+      <w:start w:val="1"/>
+      <w:numFmt w:val="bullet"/>
+      <w:lvlText w:val=""/>
+      <w:lvlJc w:val="left"/>
+      <w:pPr>
+        <w:ind w:left="5040" w:hanging="360"/>
+      </w:pPr>
+      <w:rPr>
+        <w:rFonts w:ascii="Symbol" w:hAnsi="Symbol" w:hint="default"/>
+      </w:rPr>
+    </w:lvl>
+    <w:lvl w:ilvl="7" w:tplc="40090003" w:tentative="1">
+      <w:start w:val="1"/>
+      <w:numFmt w:val="bullet"/>
+      <w:lvlText w:val="o"/>
+      <w:lvlJc w:val="left"/>
+      <w:pPr>
+        <w:ind w:left="5760" w:hanging="360"/>
+      </w:pPr>
+      <w:rPr>
+        <w:rFonts w:ascii="Courier New" w:hAnsi="Courier New" w:cs="Courier New" w:hint="default"/>
+      </w:rPr>
+    </w:lvl>
+    <w:lvl w:ilvl="8" w:tplc="40090005" w:tentative="1">
+      <w:start w:val="1"/>
+      <w:numFmt w:val="bullet"/>
+      <w:lvlText w:val=""/>
+      <w:lvlJc w:val="left"/>
+      <w:pPr>
+        <w:ind w:left="6480" w:hanging="360"/>
+      </w:pPr>
+      <w:rPr>
+        <w:rFonts w:ascii="Wingdings" w:hAnsi="Wingdings" w:hint="default"/>
+      </w:rPr>
+    </w:lvl>
+  </w:abstractNum>
+  <w:abstractNum w:abstractNumId="12" w15:restartNumberingAfterBreak="0">
     <w:nsid w:val="273D002C"/>
     <w:multiLevelType w:val="hybridMultilevel"/>
     <w:tmpl w:val="910CEBE6"/>
@@ -1681,7 +2944,7 @@
       </w:rPr>
     </w:lvl>
   </w:abstractNum>
-  <w:abstractNum w:abstractNumId="11" w15:restartNumberingAfterBreak="0">
+  <w:abstractNum w:abstractNumId="13" w15:restartNumberingAfterBreak="0">
     <w:nsid w:val="2C1F6B29"/>
     <w:multiLevelType w:val="multilevel"/>
     <w:tmpl w:val="C9322BBE"/>
@@ -1830,7 +3093,7 @@
       </w:rPr>
     </w:lvl>
   </w:abstractNum>
-  <w:abstractNum w:abstractNumId="12" w15:restartNumberingAfterBreak="0">
+  <w:abstractNum w:abstractNumId="14" w15:restartNumberingAfterBreak="0">
     <w:nsid w:val="2D76422D"/>
     <w:multiLevelType w:val="multilevel"/>
     <w:tmpl w:val="149AA924"/>
@@ -1979,7 +3242,7 @@
       </w:rPr>
     </w:lvl>
   </w:abstractNum>
-  <w:abstractNum w:abstractNumId="13" w15:restartNumberingAfterBreak="0">
+  <w:abstractNum w:abstractNumId="15" w15:restartNumberingAfterBreak="0">
     <w:nsid w:val="31193E57"/>
     <w:multiLevelType w:val="hybridMultilevel"/>
     <w:tmpl w:val="4234427E"/>
@@ -2092,7 +3355,7 @@
       </w:rPr>
     </w:lvl>
   </w:abstractNum>
-  <w:abstractNum w:abstractNumId="14" w15:restartNumberingAfterBreak="0">
+  <w:abstractNum w:abstractNumId="16" w15:restartNumberingAfterBreak="0">
     <w:nsid w:val="37AD3026"/>
     <w:multiLevelType w:val="multilevel"/>
     <w:tmpl w:val="D64CB5B4"/>
@@ -2241,7 +3504,295 @@
       </w:rPr>
     </w:lvl>
   </w:abstractNum>
-  <w:abstractNum w:abstractNumId="15" w15:restartNumberingAfterBreak="0">
+  <w:abstractNum w:abstractNumId="17" w15:restartNumberingAfterBreak="0">
+    <w:nsid w:val="38F13ADC"/>
+    <w:multiLevelType w:val="hybridMultilevel"/>
+    <w:tmpl w:val="B73C1F0E"/>
+    <w:lvl w:ilvl="0" w:tplc="3CD88326">
+      <w:start w:val="1"/>
+      <w:numFmt w:val="decimal"/>
+      <w:lvlText w:val="%1.1"/>
+      <w:lvlJc w:val="left"/>
+      <w:pPr>
+        <w:ind w:left="720" w:hanging="360"/>
+      </w:pPr>
+      <w:rPr>
+        <w:rFonts w:hint="default"/>
+      </w:rPr>
+    </w:lvl>
+    <w:lvl w:ilvl="1" w:tplc="40090019" w:tentative="1">
+      <w:start w:val="1"/>
+      <w:numFmt w:val="lowerLetter"/>
+      <w:lvlText w:val="%2."/>
+      <w:lvlJc w:val="left"/>
+      <w:pPr>
+        <w:ind w:left="1440" w:hanging="360"/>
+      </w:pPr>
+    </w:lvl>
+    <w:lvl w:ilvl="2" w:tplc="4009001B" w:tentative="1">
+      <w:start w:val="1"/>
+      <w:numFmt w:val="lowerRoman"/>
+      <w:lvlText w:val="%3."/>
+      <w:lvlJc w:val="right"/>
+      <w:pPr>
+        <w:ind w:left="2160" w:hanging="180"/>
+      </w:pPr>
+    </w:lvl>
+    <w:lvl w:ilvl="3" w:tplc="4009000F" w:tentative="1">
+      <w:start w:val="1"/>
+      <w:numFmt w:val="decimal"/>
+      <w:lvlText w:val="%4."/>
+      <w:lvlJc w:val="left"/>
+      <w:pPr>
+        <w:ind w:left="2880" w:hanging="360"/>
+      </w:pPr>
+    </w:lvl>
+    <w:lvl w:ilvl="4" w:tplc="40090019" w:tentative="1">
+      <w:start w:val="1"/>
+      <w:numFmt w:val="lowerLetter"/>
+      <w:lvlText w:val="%5."/>
+      <w:lvlJc w:val="left"/>
+      <w:pPr>
+        <w:ind w:left="3600" w:hanging="360"/>
+      </w:pPr>
+    </w:lvl>
+    <w:lvl w:ilvl="5" w:tplc="4009001B" w:tentative="1">
+      <w:start w:val="1"/>
+      <w:numFmt w:val="lowerRoman"/>
+      <w:lvlText w:val="%6."/>
+      <w:lvlJc w:val="right"/>
+      <w:pPr>
+        <w:ind w:left="4320" w:hanging="180"/>
+      </w:pPr>
+    </w:lvl>
+    <w:lvl w:ilvl="6" w:tplc="4009000F" w:tentative="1">
+      <w:start w:val="1"/>
+      <w:numFmt w:val="decimal"/>
+      <w:lvlText w:val="%7."/>
+      <w:lvlJc w:val="left"/>
+      <w:pPr>
+        <w:ind w:left="5040" w:hanging="360"/>
+      </w:pPr>
+    </w:lvl>
+    <w:lvl w:ilvl="7" w:tplc="40090019" w:tentative="1">
+      <w:start w:val="1"/>
+      <w:numFmt w:val="lowerLetter"/>
+      <w:lvlText w:val="%8."/>
+      <w:lvlJc w:val="left"/>
+      <w:pPr>
+        <w:ind w:left="5760" w:hanging="360"/>
+      </w:pPr>
+    </w:lvl>
+    <w:lvl w:ilvl="8" w:tplc="4009001B" w:tentative="1">
+      <w:start w:val="1"/>
+      <w:numFmt w:val="lowerRoman"/>
+      <w:lvlText w:val="%9."/>
+      <w:lvlJc w:val="right"/>
+      <w:pPr>
+        <w:ind w:left="6480" w:hanging="180"/>
+      </w:pPr>
+    </w:lvl>
+  </w:abstractNum>
+  <w:abstractNum w:abstractNumId="18" w15:restartNumberingAfterBreak="0">
+    <w:nsid w:val="3B0C044A"/>
+    <w:multiLevelType w:val="hybridMultilevel"/>
+    <w:tmpl w:val="74125AC4"/>
+    <w:lvl w:ilvl="0" w:tplc="40090001">
+      <w:start w:val="1"/>
+      <w:numFmt w:val="bullet"/>
+      <w:lvlText w:val=""/>
+      <w:lvlJc w:val="left"/>
+      <w:pPr>
+        <w:ind w:left="1440" w:hanging="360"/>
+      </w:pPr>
+      <w:rPr>
+        <w:rFonts w:ascii="Symbol" w:hAnsi="Symbol" w:hint="default"/>
+      </w:rPr>
+    </w:lvl>
+    <w:lvl w:ilvl="1" w:tplc="40090003" w:tentative="1">
+      <w:start w:val="1"/>
+      <w:numFmt w:val="bullet"/>
+      <w:lvlText w:val="o"/>
+      <w:lvlJc w:val="left"/>
+      <w:pPr>
+        <w:ind w:left="2160" w:hanging="360"/>
+      </w:pPr>
+      <w:rPr>
+        <w:rFonts w:ascii="Courier New" w:hAnsi="Courier New" w:cs="Courier New" w:hint="default"/>
+      </w:rPr>
+    </w:lvl>
+    <w:lvl w:ilvl="2" w:tplc="40090005" w:tentative="1">
+      <w:start w:val="1"/>
+      <w:numFmt w:val="bullet"/>
+      <w:lvlText w:val=""/>
+      <w:lvlJc w:val="left"/>
+      <w:pPr>
+        <w:ind w:left="2880" w:hanging="360"/>
+      </w:pPr>
+      <w:rPr>
+        <w:rFonts w:ascii="Wingdings" w:hAnsi="Wingdings" w:hint="default"/>
+      </w:rPr>
+    </w:lvl>
+    <w:lvl w:ilvl="3" w:tplc="40090001" w:tentative="1">
+      <w:start w:val="1"/>
+      <w:numFmt w:val="bullet"/>
+      <w:lvlText w:val=""/>
+      <w:lvlJc w:val="left"/>
+      <w:pPr>
+        <w:ind w:left="3600" w:hanging="360"/>
+      </w:pPr>
+      <w:rPr>
+        <w:rFonts w:ascii="Symbol" w:hAnsi="Symbol" w:hint="default"/>
+      </w:rPr>
+    </w:lvl>
+    <w:lvl w:ilvl="4" w:tplc="40090003" w:tentative="1">
+      <w:start w:val="1"/>
+      <w:numFmt w:val="bullet"/>
+      <w:lvlText w:val="o"/>
+      <w:lvlJc w:val="left"/>
+      <w:pPr>
+        <w:ind w:left="4320" w:hanging="360"/>
+      </w:pPr>
+      <w:rPr>
+        <w:rFonts w:ascii="Courier New" w:hAnsi="Courier New" w:cs="Courier New" w:hint="default"/>
+      </w:rPr>
+    </w:lvl>
+    <w:lvl w:ilvl="5" w:tplc="40090005" w:tentative="1">
+      <w:start w:val="1"/>
+      <w:numFmt w:val="bullet"/>
+      <w:lvlText w:val=""/>
+      <w:lvlJc w:val="left"/>
+      <w:pPr>
+        <w:ind w:left="5040" w:hanging="360"/>
+      </w:pPr>
+      <w:rPr>
+        <w:rFonts w:ascii="Wingdings" w:hAnsi="Wingdings" w:hint="default"/>
+      </w:rPr>
+    </w:lvl>
+    <w:lvl w:ilvl="6" w:tplc="40090001" w:tentative="1">
+      <w:start w:val="1"/>
+      <w:numFmt w:val="bullet"/>
+      <w:lvlText w:val=""/>
+      <w:lvlJc w:val="left"/>
+      <w:pPr>
+        <w:ind w:left="5760" w:hanging="360"/>
+      </w:pPr>
+      <w:rPr>
+        <w:rFonts w:ascii="Symbol" w:hAnsi="Symbol" w:hint="default"/>
+      </w:rPr>
+    </w:lvl>
+    <w:lvl w:ilvl="7" w:tplc="40090003" w:tentative="1">
+      <w:start w:val="1"/>
+      <w:numFmt w:val="bullet"/>
+      <w:lvlText w:val="o"/>
+      <w:lvlJc w:val="left"/>
+      <w:pPr>
+        <w:ind w:left="6480" w:hanging="360"/>
+      </w:pPr>
+      <w:rPr>
+        <w:rFonts w:ascii="Courier New" w:hAnsi="Courier New" w:cs="Courier New" w:hint="default"/>
+      </w:rPr>
+    </w:lvl>
+    <w:lvl w:ilvl="8" w:tplc="40090005" w:tentative="1">
+      <w:start w:val="1"/>
+      <w:numFmt w:val="bullet"/>
+      <w:lvlText w:val=""/>
+      <w:lvlJc w:val="left"/>
+      <w:pPr>
+        <w:ind w:left="7200" w:hanging="360"/>
+      </w:pPr>
+      <w:rPr>
+        <w:rFonts w:ascii="Wingdings" w:hAnsi="Wingdings" w:hint="default"/>
+      </w:rPr>
+    </w:lvl>
+  </w:abstractNum>
+  <w:abstractNum w:abstractNumId="19" w15:restartNumberingAfterBreak="0">
+    <w:nsid w:val="3C7A4520"/>
+    <w:multiLevelType w:val="hybridMultilevel"/>
+    <w:tmpl w:val="572C9F82"/>
+    <w:lvl w:ilvl="0" w:tplc="4009000F">
+      <w:start w:val="1"/>
+      <w:numFmt w:val="decimal"/>
+      <w:lvlText w:val="%1."/>
+      <w:lvlJc w:val="left"/>
+      <w:pPr>
+        <w:ind w:left="720" w:hanging="360"/>
+      </w:pPr>
+    </w:lvl>
+    <w:lvl w:ilvl="1" w:tplc="40090019" w:tentative="1">
+      <w:start w:val="1"/>
+      <w:numFmt w:val="lowerLetter"/>
+      <w:lvlText w:val="%2."/>
+      <w:lvlJc w:val="left"/>
+      <w:pPr>
+        <w:ind w:left="1440" w:hanging="360"/>
+      </w:pPr>
+    </w:lvl>
+    <w:lvl w:ilvl="2" w:tplc="4009001B" w:tentative="1">
+      <w:start w:val="1"/>
+      <w:numFmt w:val="lowerRoman"/>
+      <w:lvlText w:val="%3."/>
+      <w:lvlJc w:val="right"/>
+      <w:pPr>
+        <w:ind w:left="2160" w:hanging="180"/>
+      </w:pPr>
+    </w:lvl>
+    <w:lvl w:ilvl="3" w:tplc="4009000F" w:tentative="1">
+      <w:start w:val="1"/>
+      <w:numFmt w:val="decimal"/>
+      <w:lvlText w:val="%4."/>
+      <w:lvlJc w:val="left"/>
+      <w:pPr>
+        <w:ind w:left="2880" w:hanging="360"/>
+      </w:pPr>
+    </w:lvl>
+    <w:lvl w:ilvl="4" w:tplc="40090019" w:tentative="1">
+      <w:start w:val="1"/>
+      <w:numFmt w:val="lowerLetter"/>
+      <w:lvlText w:val="%5."/>
+      <w:lvlJc w:val="left"/>
+      <w:pPr>
+        <w:ind w:left="3600" w:hanging="360"/>
+      </w:pPr>
+    </w:lvl>
+    <w:lvl w:ilvl="5" w:tplc="4009001B" w:tentative="1">
+      <w:start w:val="1"/>
+      <w:numFmt w:val="lowerRoman"/>
+      <w:lvlText w:val="%6."/>
+      <w:lvlJc w:val="right"/>
+      <w:pPr>
+        <w:ind w:left="4320" w:hanging="180"/>
+      </w:pPr>
+    </w:lvl>
+    <w:lvl w:ilvl="6" w:tplc="4009000F" w:tentative="1">
+      <w:start w:val="1"/>
+      <w:numFmt w:val="decimal"/>
+      <w:lvlText w:val="%7."/>
+      <w:lvlJc w:val="left"/>
+      <w:pPr>
+        <w:ind w:left="5040" w:hanging="360"/>
+      </w:pPr>
+    </w:lvl>
+    <w:lvl w:ilvl="7" w:tplc="40090019" w:tentative="1">
+      <w:start w:val="1"/>
+      <w:numFmt w:val="lowerLetter"/>
+      <w:lvlText w:val="%8."/>
+      <w:lvlJc w:val="left"/>
+      <w:pPr>
+        <w:ind w:left="5760" w:hanging="360"/>
+      </w:pPr>
+    </w:lvl>
+    <w:lvl w:ilvl="8" w:tplc="4009001B" w:tentative="1">
+      <w:start w:val="1"/>
+      <w:numFmt w:val="lowerRoman"/>
+      <w:lvlText w:val="%9."/>
+      <w:lvlJc w:val="right"/>
+      <w:pPr>
+        <w:ind w:left="6480" w:hanging="180"/>
+      </w:pPr>
+    </w:lvl>
+  </w:abstractNum>
+  <w:abstractNum w:abstractNumId="20" w15:restartNumberingAfterBreak="0">
     <w:nsid w:val="4E3461EE"/>
     <w:multiLevelType w:val="multilevel"/>
     <w:tmpl w:val="67966C9A"/>
@@ -2354,7 +3905,7 @@
       </w:pPr>
     </w:lvl>
   </w:abstractNum>
-  <w:abstractNum w:abstractNumId="16" w15:restartNumberingAfterBreak="0">
+  <w:abstractNum w:abstractNumId="21" w15:restartNumberingAfterBreak="0">
     <w:nsid w:val="5053501A"/>
     <w:multiLevelType w:val="multilevel"/>
     <w:tmpl w:val="68422B6C"/>
@@ -2503,7 +4054,93 @@
       </w:rPr>
     </w:lvl>
   </w:abstractNum>
-  <w:abstractNum w:abstractNumId="17" w15:restartNumberingAfterBreak="0">
+  <w:abstractNum w:abstractNumId="22" w15:restartNumberingAfterBreak="0">
+    <w:nsid w:val="517F3B21"/>
+    <w:multiLevelType w:val="hybridMultilevel"/>
+    <w:tmpl w:val="67246F80"/>
+    <w:lvl w:ilvl="0" w:tplc="4009000F">
+      <w:start w:val="1"/>
+      <w:numFmt w:val="decimal"/>
+      <w:lvlText w:val="%1."/>
+      <w:lvlJc w:val="left"/>
+      <w:pPr>
+        <w:ind w:left="720" w:hanging="360"/>
+      </w:pPr>
+    </w:lvl>
+    <w:lvl w:ilvl="1" w:tplc="40090019" w:tentative="1">
+      <w:start w:val="1"/>
+      <w:numFmt w:val="lowerLetter"/>
+      <w:lvlText w:val="%2."/>
+      <w:lvlJc w:val="left"/>
+      <w:pPr>
+        <w:ind w:left="1440" w:hanging="360"/>
+      </w:pPr>
+    </w:lvl>
+    <w:lvl w:ilvl="2" w:tplc="4009001B" w:tentative="1">
+      <w:start w:val="1"/>
+      <w:numFmt w:val="lowerRoman"/>
+      <w:lvlText w:val="%3."/>
+      <w:lvlJc w:val="right"/>
+      <w:pPr>
+        <w:ind w:left="2160" w:hanging="180"/>
+      </w:pPr>
+    </w:lvl>
+    <w:lvl w:ilvl="3" w:tplc="4009000F" w:tentative="1">
+      <w:start w:val="1"/>
+      <w:numFmt w:val="decimal"/>
+      <w:lvlText w:val="%4."/>
+      <w:lvlJc w:val="left"/>
+      <w:pPr>
+        <w:ind w:left="2880" w:hanging="360"/>
+      </w:pPr>
+    </w:lvl>
+    <w:lvl w:ilvl="4" w:tplc="40090019" w:tentative="1">
+      <w:start w:val="1"/>
+      <w:numFmt w:val="lowerLetter"/>
+      <w:lvlText w:val="%5."/>
+      <w:lvlJc w:val="left"/>
+      <w:pPr>
+        <w:ind w:left="3600" w:hanging="360"/>
+      </w:pPr>
+    </w:lvl>
+    <w:lvl w:ilvl="5" w:tplc="4009001B" w:tentative="1">
+      <w:start w:val="1"/>
+      <w:numFmt w:val="lowerRoman"/>
+      <w:lvlText w:val="%6."/>
+      <w:lvlJc w:val="right"/>
+      <w:pPr>
+        <w:ind w:left="4320" w:hanging="180"/>
+      </w:pPr>
+    </w:lvl>
+    <w:lvl w:ilvl="6" w:tplc="4009000F" w:tentative="1">
+      <w:start w:val="1"/>
+      <w:numFmt w:val="decimal"/>
+      <w:lvlText w:val="%7."/>
+      <w:lvlJc w:val="left"/>
+      <w:pPr>
+        <w:ind w:left="5040" w:hanging="360"/>
+      </w:pPr>
+    </w:lvl>
+    <w:lvl w:ilvl="7" w:tplc="40090019" w:tentative="1">
+      <w:start w:val="1"/>
+      <w:numFmt w:val="lowerLetter"/>
+      <w:lvlText w:val="%8."/>
+      <w:lvlJc w:val="left"/>
+      <w:pPr>
+        <w:ind w:left="5760" w:hanging="360"/>
+      </w:pPr>
+    </w:lvl>
+    <w:lvl w:ilvl="8" w:tplc="4009001B" w:tentative="1">
+      <w:start w:val="1"/>
+      <w:numFmt w:val="lowerRoman"/>
+      <w:lvlText w:val="%9."/>
+      <w:lvlJc w:val="right"/>
+      <w:pPr>
+        <w:ind w:left="6480" w:hanging="180"/>
+      </w:pPr>
+    </w:lvl>
+  </w:abstractNum>
+  <w:abstractNum w:abstractNumId="23" w15:restartNumberingAfterBreak="0">
     <w:nsid w:val="584B0929"/>
     <w:multiLevelType w:val="hybridMultilevel"/>
     <w:tmpl w:val="2B4A1600"/>
@@ -2616,7 +4253,7 @@
       </w:rPr>
     </w:lvl>
   </w:abstractNum>
-  <w:abstractNum w:abstractNumId="18" w15:restartNumberingAfterBreak="0">
+  <w:abstractNum w:abstractNumId="24" w15:restartNumberingAfterBreak="0">
     <w:nsid w:val="60C36350"/>
     <w:multiLevelType w:val="hybridMultilevel"/>
     <w:tmpl w:val="91DC2BD6"/>
@@ -2729,7 +4366,7 @@
       </w:rPr>
     </w:lvl>
   </w:abstractNum>
-  <w:abstractNum w:abstractNumId="19" w15:restartNumberingAfterBreak="0">
+  <w:abstractNum w:abstractNumId="25" w15:restartNumberingAfterBreak="0">
     <w:nsid w:val="72267A47"/>
     <w:multiLevelType w:val="multilevel"/>
     <w:tmpl w:val="9B7A32A6"/>
@@ -2906,37 +4543,55 @@
     <w:abstractNumId w:val="0"/>
   </w:num>
   <w:num w:numId="10" w16cid:durableId="480538878">
-    <w:abstractNumId w:val="9"/>
+    <w:abstractNumId w:val="10"/>
   </w:num>
   <w:num w:numId="11" w16cid:durableId="1899710384">
+    <w:abstractNumId w:val="24"/>
+  </w:num>
+  <w:num w:numId="12" w16cid:durableId="857812715">
+    <w:abstractNumId w:val="12"/>
+  </w:num>
+  <w:num w:numId="13" w16cid:durableId="637221822">
+    <w:abstractNumId w:val="21"/>
+  </w:num>
+  <w:num w:numId="14" w16cid:durableId="573705761">
+    <w:abstractNumId w:val="14"/>
+  </w:num>
+  <w:num w:numId="15" w16cid:durableId="1180118365">
+    <w:abstractNumId w:val="13"/>
+  </w:num>
+  <w:num w:numId="16" w16cid:durableId="897011946">
+    <w:abstractNumId w:val="23"/>
+  </w:num>
+  <w:num w:numId="17" w16cid:durableId="1270358308">
+    <w:abstractNumId w:val="15"/>
+  </w:num>
+  <w:num w:numId="18" w16cid:durableId="820969923">
+    <w:abstractNumId w:val="16"/>
+  </w:num>
+  <w:num w:numId="19" w16cid:durableId="1934391620">
+    <w:abstractNumId w:val="20"/>
+  </w:num>
+  <w:num w:numId="20" w16cid:durableId="1051882706">
+    <w:abstractNumId w:val="25"/>
+  </w:num>
+  <w:num w:numId="21" w16cid:durableId="892934253">
+    <w:abstractNumId w:val="22"/>
+  </w:num>
+  <w:num w:numId="22" w16cid:durableId="509570276">
+    <w:abstractNumId w:val="19"/>
+  </w:num>
+  <w:num w:numId="23" w16cid:durableId="1404449089">
+    <w:abstractNumId w:val="17"/>
+  </w:num>
+  <w:num w:numId="24" w16cid:durableId="1731230198">
+    <w:abstractNumId w:val="11"/>
+  </w:num>
+  <w:num w:numId="25" w16cid:durableId="700671180">
     <w:abstractNumId w:val="18"/>
   </w:num>
-  <w:num w:numId="12" w16cid:durableId="857812715">
-    <w:abstractNumId w:val="10"/>
-  </w:num>
-  <w:num w:numId="13" w16cid:durableId="637221822">
-    <w:abstractNumId w:val="16"/>
-  </w:num>
-  <w:num w:numId="14" w16cid:durableId="573705761">
-    <w:abstractNumId w:val="12"/>
-  </w:num>
-  <w:num w:numId="15" w16cid:durableId="1180118365">
-    <w:abstractNumId w:val="11"/>
-  </w:num>
-  <w:num w:numId="16" w16cid:durableId="897011946">
-    <w:abstractNumId w:val="17"/>
-  </w:num>
-  <w:num w:numId="17" w16cid:durableId="1270358308">
-    <w:abstractNumId w:val="13"/>
-  </w:num>
-  <w:num w:numId="18" w16cid:durableId="820969923">
-    <w:abstractNumId w:val="14"/>
-  </w:num>
-  <w:num w:numId="19" w16cid:durableId="1934391620">
-    <w:abstractNumId w:val="15"/>
-  </w:num>
-  <w:num w:numId="20" w16cid:durableId="1051882706">
-    <w:abstractNumId w:val="19"/>
+  <w:num w:numId="26" w16cid:durableId="1695418781">
+    <w:abstractNumId w:val="9"/>
   </w:num>
 </w:numbering>
 </file>
@@ -3330,7 +4985,7 @@
   <w:style w:type="paragraph" w:default="1" w:styleId="Normal">
     <w:name w:val="Normal"/>
     <w:qFormat/>
-    <w:rsid w:val="000378C5"/>
+    <w:rsid w:val="00122B8B"/>
     <w:rPr>
       <w:rFonts w:ascii="Calibri" w:hAnsi="Calibri"/>
     </w:rPr>

</xml_diff>